<commit_message>
docs(assignment-1): update Assignment 1 template
</commit_message>
<xml_diff>
--- a/Assignment 1/Assignment 1_template.docx
+++ b/Assignment 1/Assignment 1_template.docx
@@ -197,7 +197,7 @@
             <w:fldChar w:fldCharType="begin"/>
           </w:r>
           <w:r>
-            <w:instrText xml:space="preserve"> HYPERLINK \l _Toc29359 </w:instrText>
+            <w:instrText xml:space="preserve"> HYPERLINK \l _Toc25403 </w:instrText>
           </w:r>
           <w:r>
             <w:fldChar w:fldCharType="separate"/>
@@ -212,7 +212,7 @@
             <w:fldChar w:fldCharType="begin"/>
           </w:r>
           <w:r>
-            <w:instrText xml:space="preserve"> PAGEREF _Toc29359 \h </w:instrText>
+            <w:instrText xml:space="preserve"> PAGEREF _Toc25403 \h </w:instrText>
           </w:r>
           <w:r>
             <w:fldChar w:fldCharType="separate"/>
@@ -238,7 +238,7 @@
             <w:fldChar w:fldCharType="begin"/>
           </w:r>
           <w:r>
-            <w:instrText xml:space="preserve"> HYPERLINK \l _Toc31744 </w:instrText>
+            <w:instrText xml:space="preserve"> HYPERLINK \l _Toc1795 </w:instrText>
           </w:r>
           <w:r>
             <w:fldChar w:fldCharType="separate"/>
@@ -253,7 +253,7 @@
             <w:fldChar w:fldCharType="begin"/>
           </w:r>
           <w:r>
-            <w:instrText xml:space="preserve"> PAGEREF _Toc31744 \h </w:instrText>
+            <w:instrText xml:space="preserve"> PAGEREF _Toc1795 \h </w:instrText>
           </w:r>
           <w:r>
             <w:fldChar w:fldCharType="separate"/>
@@ -279,7 +279,7 @@
             <w:fldChar w:fldCharType="begin"/>
           </w:r>
           <w:r>
-            <w:instrText xml:space="preserve"> HYPERLINK \l _Toc2816 </w:instrText>
+            <w:instrText xml:space="preserve"> HYPERLINK \l _Toc16293 </w:instrText>
           </w:r>
           <w:r>
             <w:fldChar w:fldCharType="separate"/>
@@ -298,7 +298,7 @@
             <w:fldChar w:fldCharType="begin"/>
           </w:r>
           <w:r>
-            <w:instrText xml:space="preserve"> PAGEREF _Toc2816 \h </w:instrText>
+            <w:instrText xml:space="preserve"> PAGEREF _Toc16293 \h </w:instrText>
           </w:r>
           <w:r>
             <w:fldChar w:fldCharType="separate"/>
@@ -324,7 +324,7 @@
             <w:fldChar w:fldCharType="begin"/>
           </w:r>
           <w:r>
-            <w:instrText xml:space="preserve"> HYPERLINK \l _Toc22232 </w:instrText>
+            <w:instrText xml:space="preserve"> HYPERLINK \l _Toc29956 </w:instrText>
           </w:r>
           <w:r>
             <w:fldChar w:fldCharType="separate"/>
@@ -346,7 +346,7 @@
             <w:fldChar w:fldCharType="begin"/>
           </w:r>
           <w:r>
-            <w:instrText xml:space="preserve"> PAGEREF _Toc22232 \h </w:instrText>
+            <w:instrText xml:space="preserve"> PAGEREF _Toc29956 \h </w:instrText>
           </w:r>
           <w:r>
             <w:fldChar w:fldCharType="separate"/>
@@ -372,7 +372,7 @@
             <w:fldChar w:fldCharType="begin"/>
           </w:r>
           <w:r>
-            <w:instrText xml:space="preserve"> HYPERLINK \l _Toc23480 </w:instrText>
+            <w:instrText xml:space="preserve"> HYPERLINK \l _Toc5512 </w:instrText>
           </w:r>
           <w:r>
             <w:fldChar w:fldCharType="separate"/>
@@ -394,7 +394,7 @@
             <w:fldChar w:fldCharType="begin"/>
           </w:r>
           <w:r>
-            <w:instrText xml:space="preserve"> PAGEREF _Toc23480 \h </w:instrText>
+            <w:instrText xml:space="preserve"> PAGEREF _Toc5512 \h </w:instrText>
           </w:r>
           <w:r>
             <w:fldChar w:fldCharType="separate"/>
@@ -420,7 +420,7 @@
             <w:fldChar w:fldCharType="begin"/>
           </w:r>
           <w:r>
-            <w:instrText xml:space="preserve"> HYPERLINK \l _Toc23312 </w:instrText>
+            <w:instrText xml:space="preserve"> HYPERLINK \l _Toc5831 </w:instrText>
           </w:r>
           <w:r>
             <w:fldChar w:fldCharType="separate"/>
@@ -442,7 +442,7 @@
             <w:fldChar w:fldCharType="begin"/>
           </w:r>
           <w:r>
-            <w:instrText xml:space="preserve"> PAGEREF _Toc23312 \h </w:instrText>
+            <w:instrText xml:space="preserve"> PAGEREF _Toc5831 \h </w:instrText>
           </w:r>
           <w:r>
             <w:fldChar w:fldCharType="separate"/>
@@ -468,7 +468,7 @@
             <w:fldChar w:fldCharType="begin"/>
           </w:r>
           <w:r>
-            <w:instrText xml:space="preserve"> HYPERLINK \l _Toc7569 </w:instrText>
+            <w:instrText xml:space="preserve"> HYPERLINK \l _Toc15512 </w:instrText>
           </w:r>
           <w:r>
             <w:fldChar w:fldCharType="separate"/>
@@ -497,7 +497,7 @@
             <w:fldChar w:fldCharType="begin"/>
           </w:r>
           <w:r>
-            <w:instrText xml:space="preserve"> PAGEREF _Toc7569 \h </w:instrText>
+            <w:instrText xml:space="preserve"> PAGEREF _Toc15512 \h </w:instrText>
           </w:r>
           <w:r>
             <w:fldChar w:fldCharType="separate"/>
@@ -523,7 +523,7 @@
             <w:fldChar w:fldCharType="begin"/>
           </w:r>
           <w:r>
-            <w:instrText xml:space="preserve"> HYPERLINK \l _Toc5413 </w:instrText>
+            <w:instrText xml:space="preserve"> HYPERLINK \l _Toc6318 </w:instrText>
           </w:r>
           <w:r>
             <w:fldChar w:fldCharType="separate"/>
@@ -550,7 +550,7 @@
             <w:fldChar w:fldCharType="begin"/>
           </w:r>
           <w:r>
-            <w:instrText xml:space="preserve"> PAGEREF _Toc5413 \h </w:instrText>
+            <w:instrText xml:space="preserve"> PAGEREF _Toc6318 \h </w:instrText>
           </w:r>
           <w:r>
             <w:fldChar w:fldCharType="separate"/>
@@ -576,7 +576,7 @@
             <w:fldChar w:fldCharType="begin"/>
           </w:r>
           <w:r>
-            <w:instrText xml:space="preserve"> HYPERLINK \l _Toc12053 </w:instrText>
+            <w:instrText xml:space="preserve"> HYPERLINK \l _Toc32063 </w:instrText>
           </w:r>
           <w:r>
             <w:fldChar w:fldCharType="separate"/>
@@ -601,7 +601,7 @@
             <w:fldChar w:fldCharType="begin"/>
           </w:r>
           <w:r>
-            <w:instrText xml:space="preserve"> PAGEREF _Toc12053 \h </w:instrText>
+            <w:instrText xml:space="preserve"> PAGEREF _Toc32063 \h </w:instrText>
           </w:r>
           <w:r>
             <w:fldChar w:fldCharType="separate"/>
@@ -627,7 +627,7 @@
             <w:fldChar w:fldCharType="begin"/>
           </w:r>
           <w:r>
-            <w:instrText xml:space="preserve"> HYPERLINK \l _Toc25968 </w:instrText>
+            <w:instrText xml:space="preserve"> HYPERLINK \l _Toc193 </w:instrText>
           </w:r>
           <w:r>
             <w:fldChar w:fldCharType="separate"/>
@@ -659,7 +659,7 @@
             <w:fldChar w:fldCharType="begin"/>
           </w:r>
           <w:r>
-            <w:instrText xml:space="preserve"> PAGEREF _Toc25968 \h </w:instrText>
+            <w:instrText xml:space="preserve"> PAGEREF _Toc193 \h </w:instrText>
           </w:r>
           <w:r>
             <w:fldChar w:fldCharType="separate"/>
@@ -685,7 +685,7 @@
             <w:fldChar w:fldCharType="begin"/>
           </w:r>
           <w:r>
-            <w:instrText xml:space="preserve"> HYPERLINK \l _Toc25417 </w:instrText>
+            <w:instrText xml:space="preserve"> HYPERLINK \l _Toc20360 </w:instrText>
           </w:r>
           <w:r>
             <w:fldChar w:fldCharType="separate"/>
@@ -717,7 +717,7 @@
             <w:fldChar w:fldCharType="begin"/>
           </w:r>
           <w:r>
-            <w:instrText xml:space="preserve"> PAGEREF _Toc25417 \h </w:instrText>
+            <w:instrText xml:space="preserve"> PAGEREF _Toc20360 \h </w:instrText>
           </w:r>
           <w:r>
             <w:fldChar w:fldCharType="separate"/>
@@ -743,7 +743,7 @@
             <w:fldChar w:fldCharType="begin"/>
           </w:r>
           <w:r>
-            <w:instrText xml:space="preserve"> HYPERLINK \l _Toc16047 </w:instrText>
+            <w:instrText xml:space="preserve"> HYPERLINK \l _Toc20606 </w:instrText>
           </w:r>
           <w:r>
             <w:fldChar w:fldCharType="separate"/>
@@ -775,7 +775,7 @@
             <w:fldChar w:fldCharType="begin"/>
           </w:r>
           <w:r>
-            <w:instrText xml:space="preserve"> PAGEREF _Toc16047 \h </w:instrText>
+            <w:instrText xml:space="preserve"> PAGEREF _Toc20606 \h </w:instrText>
           </w:r>
           <w:r>
             <w:fldChar w:fldCharType="separate"/>
@@ -801,7 +801,7 @@
             <w:fldChar w:fldCharType="begin"/>
           </w:r>
           <w:r>
-            <w:instrText xml:space="preserve"> HYPERLINK \l _Toc18073 </w:instrText>
+            <w:instrText xml:space="preserve"> HYPERLINK \l _Toc23084 </w:instrText>
           </w:r>
           <w:r>
             <w:fldChar w:fldCharType="separate"/>
@@ -833,7 +833,7 @@
             <w:fldChar w:fldCharType="begin"/>
           </w:r>
           <w:r>
-            <w:instrText xml:space="preserve"> PAGEREF _Toc18073 \h </w:instrText>
+            <w:instrText xml:space="preserve"> PAGEREF _Toc23084 \h </w:instrText>
           </w:r>
           <w:r>
             <w:fldChar w:fldCharType="separate"/>
@@ -859,7 +859,7 @@
             <w:fldChar w:fldCharType="begin"/>
           </w:r>
           <w:r>
-            <w:instrText xml:space="preserve"> HYPERLINK \l _Toc21944 </w:instrText>
+            <w:instrText xml:space="preserve"> HYPERLINK \l _Toc23071 </w:instrText>
           </w:r>
           <w:r>
             <w:fldChar w:fldCharType="separate"/>
@@ -890,7 +890,7 @@
             <w:fldChar w:fldCharType="begin"/>
           </w:r>
           <w:r>
-            <w:instrText xml:space="preserve"> PAGEREF _Toc21944 \h </w:instrText>
+            <w:instrText xml:space="preserve"> PAGEREF _Toc23071 \h </w:instrText>
           </w:r>
           <w:r>
             <w:fldChar w:fldCharType="separate"/>
@@ -916,7 +916,7 @@
             <w:fldChar w:fldCharType="begin"/>
           </w:r>
           <w:r>
-            <w:instrText xml:space="preserve"> HYPERLINK \l _Toc5170 </w:instrText>
+            <w:instrText xml:space="preserve"> HYPERLINK \l _Toc31552 </w:instrText>
           </w:r>
           <w:r>
             <w:fldChar w:fldCharType="separate"/>
@@ -945,7 +945,7 @@
             <w:fldChar w:fldCharType="begin"/>
           </w:r>
           <w:r>
-            <w:instrText xml:space="preserve"> PAGEREF _Toc5170 \h </w:instrText>
+            <w:instrText xml:space="preserve"> PAGEREF _Toc31552 \h </w:instrText>
           </w:r>
           <w:r>
             <w:fldChar w:fldCharType="separate"/>
@@ -971,7 +971,7 @@
             <w:fldChar w:fldCharType="begin"/>
           </w:r>
           <w:r>
-            <w:instrText xml:space="preserve"> HYPERLINK \l _Toc13293 </w:instrText>
+            <w:instrText xml:space="preserve"> HYPERLINK \l _Toc3364 </w:instrText>
           </w:r>
           <w:r>
             <w:fldChar w:fldCharType="separate"/>
@@ -993,7 +993,7 @@
             <w:fldChar w:fldCharType="begin"/>
           </w:r>
           <w:r>
-            <w:instrText xml:space="preserve"> PAGEREF _Toc13293 \h </w:instrText>
+            <w:instrText xml:space="preserve"> PAGEREF _Toc3364 \h </w:instrText>
           </w:r>
           <w:r>
             <w:fldChar w:fldCharType="separate"/>
@@ -1019,7 +1019,7 @@
             <w:fldChar w:fldCharType="begin"/>
           </w:r>
           <w:r>
-            <w:instrText xml:space="preserve"> HYPERLINK \l _Toc10036 </w:instrText>
+            <w:instrText xml:space="preserve"> HYPERLINK \l _Toc12051 </w:instrText>
           </w:r>
           <w:r>
             <w:fldChar w:fldCharType="separate"/>
@@ -1041,7 +1041,7 @@
             <w:fldChar w:fldCharType="begin"/>
           </w:r>
           <w:r>
-            <w:instrText xml:space="preserve"> PAGEREF _Toc10036 \h </w:instrText>
+            <w:instrText xml:space="preserve"> PAGEREF _Toc12051 \h </w:instrText>
           </w:r>
           <w:r>
             <w:fldChar w:fldCharType="separate"/>
@@ -1067,7 +1067,7 @@
             <w:fldChar w:fldCharType="begin"/>
           </w:r>
           <w:r>
-            <w:instrText xml:space="preserve"> HYPERLINK \l _Toc27177 </w:instrText>
+            <w:instrText xml:space="preserve"> HYPERLINK \l _Toc23590 </w:instrText>
           </w:r>
           <w:r>
             <w:fldChar w:fldCharType="separate"/>
@@ -1089,7 +1089,7 @@
             <w:fldChar w:fldCharType="begin"/>
           </w:r>
           <w:r>
-            <w:instrText xml:space="preserve"> PAGEREF _Toc27177 \h </w:instrText>
+            <w:instrText xml:space="preserve"> PAGEREF _Toc23590 \h </w:instrText>
           </w:r>
           <w:r>
             <w:fldChar w:fldCharType="separate"/>
@@ -1115,7 +1115,7 @@
             <w:fldChar w:fldCharType="begin"/>
           </w:r>
           <w:r>
-            <w:instrText xml:space="preserve"> HYPERLINK \l _Toc20060 </w:instrText>
+            <w:instrText xml:space="preserve"> HYPERLINK \l _Toc3900 </w:instrText>
           </w:r>
           <w:r>
             <w:fldChar w:fldCharType="separate"/>
@@ -1137,7 +1137,7 @@
             <w:fldChar w:fldCharType="begin"/>
           </w:r>
           <w:r>
-            <w:instrText xml:space="preserve"> PAGEREF _Toc20060 \h </w:instrText>
+            <w:instrText xml:space="preserve"> PAGEREF _Toc3900 \h </w:instrText>
           </w:r>
           <w:r>
             <w:fldChar w:fldCharType="separate"/>
@@ -1163,7 +1163,7 @@
             <w:fldChar w:fldCharType="begin"/>
           </w:r>
           <w:r>
-            <w:instrText xml:space="preserve"> HYPERLINK \l _Toc20542 </w:instrText>
+            <w:instrText xml:space="preserve"> HYPERLINK \l _Toc11834 </w:instrText>
           </w:r>
           <w:r>
             <w:fldChar w:fldCharType="separate"/>
@@ -1185,7 +1185,7 @@
             <w:fldChar w:fldCharType="begin"/>
           </w:r>
           <w:r>
-            <w:instrText xml:space="preserve"> PAGEREF _Toc20542 \h </w:instrText>
+            <w:instrText xml:space="preserve"> PAGEREF _Toc11834 \h </w:instrText>
           </w:r>
           <w:r>
             <w:fldChar w:fldCharType="separate"/>
@@ -1211,7 +1211,7 @@
             <w:fldChar w:fldCharType="begin"/>
           </w:r>
           <w:r>
-            <w:instrText xml:space="preserve"> HYPERLINK \l _Toc24087 </w:instrText>
+            <w:instrText xml:space="preserve"> HYPERLINK \l _Toc13040 </w:instrText>
           </w:r>
           <w:r>
             <w:fldChar w:fldCharType="separate"/>
@@ -1242,7 +1242,7 @@
             <w:fldChar w:fldCharType="begin"/>
           </w:r>
           <w:r>
-            <w:instrText xml:space="preserve"> PAGEREF _Toc24087 \h </w:instrText>
+            <w:instrText xml:space="preserve"> PAGEREF _Toc13040 \h </w:instrText>
           </w:r>
           <w:r>
             <w:fldChar w:fldCharType="separate"/>
@@ -1268,7 +1268,7 @@
             <w:fldChar w:fldCharType="begin"/>
           </w:r>
           <w:r>
-            <w:instrText xml:space="preserve"> HYPERLINK \l _Toc23870 </w:instrText>
+            <w:instrText xml:space="preserve"> HYPERLINK \l _Toc8300 </w:instrText>
           </w:r>
           <w:r>
             <w:fldChar w:fldCharType="separate"/>
@@ -1290,7 +1290,7 @@
             <w:fldChar w:fldCharType="begin"/>
           </w:r>
           <w:r>
-            <w:instrText xml:space="preserve"> PAGEREF _Toc23870 \h </w:instrText>
+            <w:instrText xml:space="preserve"> PAGEREF _Toc8300 \h </w:instrText>
           </w:r>
           <w:r>
             <w:fldChar w:fldCharType="separate"/>
@@ -1316,7 +1316,7 @@
             <w:fldChar w:fldCharType="begin"/>
           </w:r>
           <w:r>
-            <w:instrText xml:space="preserve"> HYPERLINK \l _Toc31778 </w:instrText>
+            <w:instrText xml:space="preserve"> HYPERLINK \l _Toc17166 </w:instrText>
           </w:r>
           <w:r>
             <w:fldChar w:fldCharType="separate"/>
@@ -1338,7 +1338,7 @@
             <w:fldChar w:fldCharType="begin"/>
           </w:r>
           <w:r>
-            <w:instrText xml:space="preserve"> PAGEREF _Toc31778 \h </w:instrText>
+            <w:instrText xml:space="preserve"> PAGEREF _Toc17166 \h </w:instrText>
           </w:r>
           <w:r>
             <w:fldChar w:fldCharType="separate"/>
@@ -1364,7 +1364,7 @@
             <w:fldChar w:fldCharType="begin"/>
           </w:r>
           <w:r>
-            <w:instrText xml:space="preserve"> HYPERLINK \l _Toc18208 </w:instrText>
+            <w:instrText xml:space="preserve"> HYPERLINK \l _Toc16412 </w:instrText>
           </w:r>
           <w:r>
             <w:fldChar w:fldCharType="separate"/>
@@ -1386,7 +1386,7 @@
             <w:fldChar w:fldCharType="begin"/>
           </w:r>
           <w:r>
-            <w:instrText xml:space="preserve"> PAGEREF _Toc18208 \h </w:instrText>
+            <w:instrText xml:space="preserve"> PAGEREF _Toc16412 \h </w:instrText>
           </w:r>
           <w:r>
             <w:fldChar w:fldCharType="separate"/>
@@ -1412,7 +1412,7 @@
             <w:fldChar w:fldCharType="begin"/>
           </w:r>
           <w:r>
-            <w:instrText xml:space="preserve"> HYPERLINK \l _Toc14617 </w:instrText>
+            <w:instrText xml:space="preserve"> HYPERLINK \l _Toc26499 </w:instrText>
           </w:r>
           <w:r>
             <w:fldChar w:fldCharType="separate"/>
@@ -1443,7 +1443,7 @@
             <w:fldChar w:fldCharType="begin"/>
           </w:r>
           <w:r>
-            <w:instrText xml:space="preserve"> PAGEREF _Toc14617 \h </w:instrText>
+            <w:instrText xml:space="preserve"> PAGEREF _Toc26499 \h </w:instrText>
           </w:r>
           <w:r>
             <w:fldChar w:fldCharType="separate"/>
@@ -1469,7 +1469,7 @@
             <w:fldChar w:fldCharType="begin"/>
           </w:r>
           <w:r>
-            <w:instrText xml:space="preserve"> HYPERLINK \l _Toc19587 </w:instrText>
+            <w:instrText xml:space="preserve"> HYPERLINK \l _Toc27975 </w:instrText>
           </w:r>
           <w:r>
             <w:fldChar w:fldCharType="separate"/>
@@ -1491,7 +1491,7 @@
             <w:fldChar w:fldCharType="begin"/>
           </w:r>
           <w:r>
-            <w:instrText xml:space="preserve"> PAGEREF _Toc19587 \h </w:instrText>
+            <w:instrText xml:space="preserve"> PAGEREF _Toc27975 \h </w:instrText>
           </w:r>
           <w:r>
             <w:fldChar w:fldCharType="separate"/>
@@ -1517,7 +1517,7 @@
             <w:fldChar w:fldCharType="begin"/>
           </w:r>
           <w:r>
-            <w:instrText xml:space="preserve"> HYPERLINK \l _Toc28590 </w:instrText>
+            <w:instrText xml:space="preserve"> HYPERLINK \l _Toc8448 </w:instrText>
           </w:r>
           <w:r>
             <w:fldChar w:fldCharType="separate"/>
@@ -1539,7 +1539,7 @@
             <w:fldChar w:fldCharType="begin"/>
           </w:r>
           <w:r>
-            <w:instrText xml:space="preserve"> PAGEREF _Toc28590 \h </w:instrText>
+            <w:instrText xml:space="preserve"> PAGEREF _Toc8448 \h </w:instrText>
           </w:r>
           <w:r>
             <w:fldChar w:fldCharType="separate"/>
@@ -1565,7 +1565,7 @@
             <w:fldChar w:fldCharType="begin"/>
           </w:r>
           <w:r>
-            <w:instrText xml:space="preserve"> HYPERLINK \l _Toc24994 </w:instrText>
+            <w:instrText xml:space="preserve"> HYPERLINK \l _Toc19450 </w:instrText>
           </w:r>
           <w:r>
             <w:fldChar w:fldCharType="separate"/>
@@ -1587,7 +1587,7 @@
             <w:fldChar w:fldCharType="begin"/>
           </w:r>
           <w:r>
-            <w:instrText xml:space="preserve"> PAGEREF _Toc24994 \h </w:instrText>
+            <w:instrText xml:space="preserve"> PAGEREF _Toc19450 \h </w:instrText>
           </w:r>
           <w:r>
             <w:fldChar w:fldCharType="separate"/>
@@ -1613,7 +1613,7 @@
             <w:fldChar w:fldCharType="begin"/>
           </w:r>
           <w:r>
-            <w:instrText xml:space="preserve"> HYPERLINK \l _Toc24154 </w:instrText>
+            <w:instrText xml:space="preserve"> HYPERLINK \l _Toc30988 </w:instrText>
           </w:r>
           <w:r>
             <w:fldChar w:fldCharType="separate"/>
@@ -1635,7 +1635,7 @@
             <w:fldChar w:fldCharType="begin"/>
           </w:r>
           <w:r>
-            <w:instrText xml:space="preserve"> PAGEREF _Toc24154 \h </w:instrText>
+            <w:instrText xml:space="preserve"> PAGEREF _Toc30988 \h </w:instrText>
           </w:r>
           <w:r>
             <w:fldChar w:fldCharType="separate"/>
@@ -1661,7 +1661,7 @@
             <w:fldChar w:fldCharType="begin"/>
           </w:r>
           <w:r>
-            <w:instrText xml:space="preserve"> HYPERLINK \l _Toc426 </w:instrText>
+            <w:instrText xml:space="preserve"> HYPERLINK \l _Toc9861 </w:instrText>
           </w:r>
           <w:r>
             <w:fldChar w:fldCharType="separate"/>
@@ -1692,7 +1692,7 @@
             <w:fldChar w:fldCharType="begin"/>
           </w:r>
           <w:r>
-            <w:instrText xml:space="preserve"> PAGEREF _Toc426 \h </w:instrText>
+            <w:instrText xml:space="preserve"> PAGEREF _Toc9861 \h </w:instrText>
           </w:r>
           <w:r>
             <w:fldChar w:fldCharType="separate"/>
@@ -1718,7 +1718,7 @@
             <w:fldChar w:fldCharType="begin"/>
           </w:r>
           <w:r>
-            <w:instrText xml:space="preserve"> HYPERLINK \l _Toc22464 </w:instrText>
+            <w:instrText xml:space="preserve"> HYPERLINK \l _Toc1019 </w:instrText>
           </w:r>
           <w:r>
             <w:fldChar w:fldCharType="separate"/>
@@ -1740,7 +1740,7 @@
             <w:fldChar w:fldCharType="begin"/>
           </w:r>
           <w:r>
-            <w:instrText xml:space="preserve"> PAGEREF _Toc22464 \h </w:instrText>
+            <w:instrText xml:space="preserve"> PAGEREF _Toc1019 \h </w:instrText>
           </w:r>
           <w:r>
             <w:fldChar w:fldCharType="separate"/>
@@ -1766,7 +1766,7 @@
             <w:fldChar w:fldCharType="begin"/>
           </w:r>
           <w:r>
-            <w:instrText xml:space="preserve"> HYPERLINK \l _Toc12316 </w:instrText>
+            <w:instrText xml:space="preserve"> HYPERLINK \l _Toc28203 </w:instrText>
           </w:r>
           <w:r>
             <w:fldChar w:fldCharType="separate"/>
@@ -1788,7 +1788,7 @@
             <w:fldChar w:fldCharType="begin"/>
           </w:r>
           <w:r>
-            <w:instrText xml:space="preserve"> PAGEREF _Toc12316 \h </w:instrText>
+            <w:instrText xml:space="preserve"> PAGEREF _Toc28203 \h </w:instrText>
           </w:r>
           <w:r>
             <w:fldChar w:fldCharType="separate"/>
@@ -1814,7 +1814,7 @@
             <w:fldChar w:fldCharType="begin"/>
           </w:r>
           <w:r>
-            <w:instrText xml:space="preserve"> HYPERLINK \l _Toc1830 </w:instrText>
+            <w:instrText xml:space="preserve"> HYPERLINK \l _Toc19284 </w:instrText>
           </w:r>
           <w:r>
             <w:fldChar w:fldCharType="separate"/>
@@ -1836,7 +1836,7 @@
             <w:fldChar w:fldCharType="begin"/>
           </w:r>
           <w:r>
-            <w:instrText xml:space="preserve"> PAGEREF _Toc1830 \h </w:instrText>
+            <w:instrText xml:space="preserve"> PAGEREF _Toc19284 \h </w:instrText>
           </w:r>
           <w:r>
             <w:fldChar w:fldCharType="separate"/>
@@ -1862,7 +1862,7 @@
             <w:fldChar w:fldCharType="begin"/>
           </w:r>
           <w:r>
-            <w:instrText xml:space="preserve"> HYPERLINK \l _Toc20956 </w:instrText>
+            <w:instrText xml:space="preserve"> HYPERLINK \l _Toc13917 </w:instrText>
           </w:r>
           <w:r>
             <w:fldChar w:fldCharType="separate"/>
@@ -1884,7 +1884,7 @@
             <w:fldChar w:fldCharType="begin"/>
           </w:r>
           <w:r>
-            <w:instrText xml:space="preserve"> PAGEREF _Toc20956 \h </w:instrText>
+            <w:instrText xml:space="preserve"> PAGEREF _Toc13917 \h </w:instrText>
           </w:r>
           <w:r>
             <w:fldChar w:fldCharType="separate"/>
@@ -1910,7 +1910,7 @@
             <w:fldChar w:fldCharType="begin"/>
           </w:r>
           <w:r>
-            <w:instrText xml:space="preserve"> HYPERLINK \l _Toc29098 </w:instrText>
+            <w:instrText xml:space="preserve"> HYPERLINK \l _Toc11431 </w:instrText>
           </w:r>
           <w:r>
             <w:fldChar w:fldCharType="separate"/>
@@ -1941,7 +1941,7 @@
             <w:fldChar w:fldCharType="begin"/>
           </w:r>
           <w:r>
-            <w:instrText xml:space="preserve"> PAGEREF _Toc29098 \h </w:instrText>
+            <w:instrText xml:space="preserve"> PAGEREF _Toc11431 \h </w:instrText>
           </w:r>
           <w:r>
             <w:fldChar w:fldCharType="separate"/>
@@ -1967,7 +1967,7 @@
             <w:fldChar w:fldCharType="begin"/>
           </w:r>
           <w:r>
-            <w:instrText xml:space="preserve"> HYPERLINK \l _Toc1053 </w:instrText>
+            <w:instrText xml:space="preserve"> HYPERLINK \l _Toc9924 </w:instrText>
           </w:r>
           <w:r>
             <w:fldChar w:fldCharType="separate"/>
@@ -1989,7 +1989,7 @@
             <w:fldChar w:fldCharType="begin"/>
           </w:r>
           <w:r>
-            <w:instrText xml:space="preserve"> PAGEREF _Toc1053 \h </w:instrText>
+            <w:instrText xml:space="preserve"> PAGEREF _Toc9924 \h </w:instrText>
           </w:r>
           <w:r>
             <w:fldChar w:fldCharType="separate"/>
@@ -2015,7 +2015,7 @@
             <w:fldChar w:fldCharType="begin"/>
           </w:r>
           <w:r>
-            <w:instrText xml:space="preserve"> HYPERLINK \l _Toc25116 </w:instrText>
+            <w:instrText xml:space="preserve"> HYPERLINK \l _Toc22508 </w:instrText>
           </w:r>
           <w:r>
             <w:fldChar w:fldCharType="separate"/>
@@ -2037,7 +2037,7 @@
             <w:fldChar w:fldCharType="begin"/>
           </w:r>
           <w:r>
-            <w:instrText xml:space="preserve"> PAGEREF _Toc25116 \h </w:instrText>
+            <w:instrText xml:space="preserve"> PAGEREF _Toc22508 \h </w:instrText>
           </w:r>
           <w:r>
             <w:fldChar w:fldCharType="separate"/>
@@ -2063,7 +2063,7 @@
             <w:fldChar w:fldCharType="begin"/>
           </w:r>
           <w:r>
-            <w:instrText xml:space="preserve"> HYPERLINK \l _Toc1869 </w:instrText>
+            <w:instrText xml:space="preserve"> HYPERLINK \l _Toc678 </w:instrText>
           </w:r>
           <w:r>
             <w:fldChar w:fldCharType="separate"/>
@@ -2085,7 +2085,7 @@
             <w:fldChar w:fldCharType="begin"/>
           </w:r>
           <w:r>
-            <w:instrText xml:space="preserve"> PAGEREF _Toc1869 \h </w:instrText>
+            <w:instrText xml:space="preserve"> PAGEREF _Toc678 \h </w:instrText>
           </w:r>
           <w:r>
             <w:fldChar w:fldCharType="separate"/>
@@ -2111,7 +2111,7 @@
             <w:fldChar w:fldCharType="begin"/>
           </w:r>
           <w:r>
-            <w:instrText xml:space="preserve"> HYPERLINK \l _Toc7328 </w:instrText>
+            <w:instrText xml:space="preserve"> HYPERLINK \l _Toc12756 </w:instrText>
           </w:r>
           <w:r>
             <w:fldChar w:fldCharType="separate"/>
@@ -2133,7 +2133,7 @@
             <w:fldChar w:fldCharType="begin"/>
           </w:r>
           <w:r>
-            <w:instrText xml:space="preserve"> PAGEREF _Toc7328 \h </w:instrText>
+            <w:instrText xml:space="preserve"> PAGEREF _Toc12756 \h </w:instrText>
           </w:r>
           <w:r>
             <w:fldChar w:fldCharType="separate"/>
@@ -2159,7 +2159,7 @@
             <w:fldChar w:fldCharType="begin"/>
           </w:r>
           <w:r>
-            <w:instrText xml:space="preserve"> HYPERLINK \l _Toc18085 </w:instrText>
+            <w:instrText xml:space="preserve"> HYPERLINK \l _Toc6250 </w:instrText>
           </w:r>
           <w:r>
             <w:fldChar w:fldCharType="separate"/>
@@ -2181,7 +2181,7 @@
             <w:fldChar w:fldCharType="begin"/>
           </w:r>
           <w:r>
-            <w:instrText xml:space="preserve"> PAGEREF _Toc18085 \h </w:instrText>
+            <w:instrText xml:space="preserve"> PAGEREF _Toc6250 \h </w:instrText>
           </w:r>
           <w:r>
             <w:fldChar w:fldCharType="separate"/>
@@ -2207,7 +2207,7 @@
             <w:fldChar w:fldCharType="begin"/>
           </w:r>
           <w:r>
-            <w:instrText xml:space="preserve"> HYPERLINK \l _Toc24719 </w:instrText>
+            <w:instrText xml:space="preserve"> HYPERLINK \l _Toc16825 </w:instrText>
           </w:r>
           <w:r>
             <w:fldChar w:fldCharType="separate"/>
@@ -2238,7 +2238,7 @@
             <w:fldChar w:fldCharType="begin"/>
           </w:r>
           <w:r>
-            <w:instrText xml:space="preserve"> PAGEREF _Toc24719 \h </w:instrText>
+            <w:instrText xml:space="preserve"> PAGEREF _Toc16825 \h </w:instrText>
           </w:r>
           <w:r>
             <w:fldChar w:fldCharType="separate"/>
@@ -2264,7 +2264,7 @@
             <w:fldChar w:fldCharType="begin"/>
           </w:r>
           <w:r>
-            <w:instrText xml:space="preserve"> HYPERLINK \l _Toc2323 </w:instrText>
+            <w:instrText xml:space="preserve"> HYPERLINK \l _Toc16967 </w:instrText>
           </w:r>
           <w:r>
             <w:fldChar w:fldCharType="separate"/>
@@ -2286,7 +2286,7 @@
             <w:fldChar w:fldCharType="begin"/>
           </w:r>
           <w:r>
-            <w:instrText xml:space="preserve"> PAGEREF _Toc2323 \h </w:instrText>
+            <w:instrText xml:space="preserve"> PAGEREF _Toc16967 \h </w:instrText>
           </w:r>
           <w:r>
             <w:fldChar w:fldCharType="separate"/>
@@ -2312,7 +2312,7 @@
             <w:fldChar w:fldCharType="begin"/>
           </w:r>
           <w:r>
-            <w:instrText xml:space="preserve"> HYPERLINK \l _Toc12846 </w:instrText>
+            <w:instrText xml:space="preserve"> HYPERLINK \l _Toc20505 </w:instrText>
           </w:r>
           <w:r>
             <w:fldChar w:fldCharType="separate"/>
@@ -2334,7 +2334,7 @@
             <w:fldChar w:fldCharType="begin"/>
           </w:r>
           <w:r>
-            <w:instrText xml:space="preserve"> PAGEREF _Toc12846 \h </w:instrText>
+            <w:instrText xml:space="preserve"> PAGEREF _Toc20505 \h </w:instrText>
           </w:r>
           <w:r>
             <w:fldChar w:fldCharType="separate"/>
@@ -2360,7 +2360,7 @@
             <w:fldChar w:fldCharType="begin"/>
           </w:r>
           <w:r>
-            <w:instrText xml:space="preserve"> HYPERLINK \l _Toc32404 </w:instrText>
+            <w:instrText xml:space="preserve"> HYPERLINK \l _Toc10596 </w:instrText>
           </w:r>
           <w:r>
             <w:fldChar w:fldCharType="separate"/>
@@ -2382,7 +2382,7 @@
             <w:fldChar w:fldCharType="begin"/>
           </w:r>
           <w:r>
-            <w:instrText xml:space="preserve"> PAGEREF _Toc32404 \h </w:instrText>
+            <w:instrText xml:space="preserve"> PAGEREF _Toc10596 \h </w:instrText>
           </w:r>
           <w:r>
             <w:fldChar w:fldCharType="separate"/>
@@ -2408,7 +2408,7 @@
             <w:fldChar w:fldCharType="begin"/>
           </w:r>
           <w:r>
-            <w:instrText xml:space="preserve"> HYPERLINK \l _Toc29484 </w:instrText>
+            <w:instrText xml:space="preserve"> HYPERLINK \l _Toc16817 </w:instrText>
           </w:r>
           <w:r>
             <w:fldChar w:fldCharType="separate"/>
@@ -2430,7 +2430,7 @@
             <w:fldChar w:fldCharType="begin"/>
           </w:r>
           <w:r>
-            <w:instrText xml:space="preserve"> PAGEREF _Toc29484 \h </w:instrText>
+            <w:instrText xml:space="preserve"> PAGEREF _Toc16817 \h </w:instrText>
           </w:r>
           <w:r>
             <w:fldChar w:fldCharType="separate"/>
@@ -2456,7 +2456,7 @@
             <w:fldChar w:fldCharType="begin"/>
           </w:r>
           <w:r>
-            <w:instrText xml:space="preserve"> HYPERLINK \l _Toc13624 </w:instrText>
+            <w:instrText xml:space="preserve"> HYPERLINK \l _Toc18159 </w:instrText>
           </w:r>
           <w:r>
             <w:fldChar w:fldCharType="separate"/>
@@ -2478,7 +2478,7 @@
             <w:fldChar w:fldCharType="begin"/>
           </w:r>
           <w:r>
-            <w:instrText xml:space="preserve"> PAGEREF _Toc13624 \h </w:instrText>
+            <w:instrText xml:space="preserve"> PAGEREF _Toc18159 \h </w:instrText>
           </w:r>
           <w:r>
             <w:fldChar w:fldCharType="separate"/>
@@ -2504,7 +2504,7 @@
             <w:fldChar w:fldCharType="begin"/>
           </w:r>
           <w:r>
-            <w:instrText xml:space="preserve"> HYPERLINK \l _Toc18442 </w:instrText>
+            <w:instrText xml:space="preserve"> HYPERLINK \l _Toc23738 </w:instrText>
           </w:r>
           <w:r>
             <w:fldChar w:fldCharType="separate"/>
@@ -2526,7 +2526,7 @@
             <w:fldChar w:fldCharType="begin"/>
           </w:r>
           <w:r>
-            <w:instrText xml:space="preserve"> PAGEREF _Toc18442 \h </w:instrText>
+            <w:instrText xml:space="preserve"> PAGEREF _Toc23738 \h </w:instrText>
           </w:r>
           <w:r>
             <w:fldChar w:fldCharType="separate"/>
@@ -2552,7 +2552,7 @@
             <w:fldChar w:fldCharType="begin"/>
           </w:r>
           <w:r>
-            <w:instrText xml:space="preserve"> HYPERLINK \l _Toc7011 </w:instrText>
+            <w:instrText xml:space="preserve"> HYPERLINK \l _Toc15092 </w:instrText>
           </w:r>
           <w:r>
             <w:fldChar w:fldCharType="separate"/>
@@ -2574,7 +2574,7 @@
             <w:fldChar w:fldCharType="begin"/>
           </w:r>
           <w:r>
-            <w:instrText xml:space="preserve"> PAGEREF _Toc7011 \h </w:instrText>
+            <w:instrText xml:space="preserve"> PAGEREF _Toc15092 \h </w:instrText>
           </w:r>
           <w:r>
             <w:fldChar w:fldCharType="separate"/>
@@ -2600,7 +2600,7 @@
             <w:fldChar w:fldCharType="begin"/>
           </w:r>
           <w:r>
-            <w:instrText xml:space="preserve"> HYPERLINK \l _Toc31197 </w:instrText>
+            <w:instrText xml:space="preserve"> HYPERLINK \l _Toc20703 </w:instrText>
           </w:r>
           <w:r>
             <w:fldChar w:fldCharType="separate"/>
@@ -2631,7 +2631,7 @@
             <w:fldChar w:fldCharType="begin"/>
           </w:r>
           <w:r>
-            <w:instrText xml:space="preserve"> PAGEREF _Toc31197 \h </w:instrText>
+            <w:instrText xml:space="preserve"> PAGEREF _Toc20703 \h </w:instrText>
           </w:r>
           <w:r>
             <w:fldChar w:fldCharType="separate"/>
@@ -2657,7 +2657,7 @@
             <w:fldChar w:fldCharType="begin"/>
           </w:r>
           <w:r>
-            <w:instrText xml:space="preserve"> HYPERLINK \l _Toc8462 </w:instrText>
+            <w:instrText xml:space="preserve"> HYPERLINK \l _Toc3846 </w:instrText>
           </w:r>
           <w:r>
             <w:fldChar w:fldCharType="separate"/>
@@ -2679,7 +2679,7 @@
             <w:fldChar w:fldCharType="begin"/>
           </w:r>
           <w:r>
-            <w:instrText xml:space="preserve"> PAGEREF _Toc8462 \h </w:instrText>
+            <w:instrText xml:space="preserve"> PAGEREF _Toc3846 \h </w:instrText>
           </w:r>
           <w:r>
             <w:fldChar w:fldCharType="separate"/>
@@ -2705,7 +2705,7 @@
             <w:fldChar w:fldCharType="begin"/>
           </w:r>
           <w:r>
-            <w:instrText xml:space="preserve"> HYPERLINK \l _Toc16140 </w:instrText>
+            <w:instrText xml:space="preserve"> HYPERLINK \l _Toc24527 </w:instrText>
           </w:r>
           <w:r>
             <w:fldChar w:fldCharType="separate"/>
@@ -2727,7 +2727,7 @@
             <w:fldChar w:fldCharType="begin"/>
           </w:r>
           <w:r>
-            <w:instrText xml:space="preserve"> PAGEREF _Toc16140 \h </w:instrText>
+            <w:instrText xml:space="preserve"> PAGEREF _Toc24527 \h </w:instrText>
           </w:r>
           <w:r>
             <w:fldChar w:fldCharType="separate"/>
@@ -2753,7 +2753,7 @@
             <w:fldChar w:fldCharType="begin"/>
           </w:r>
           <w:r>
-            <w:instrText xml:space="preserve"> HYPERLINK \l _Toc22546 </w:instrText>
+            <w:instrText xml:space="preserve"> HYPERLINK \l _Toc27368 </w:instrText>
           </w:r>
           <w:r>
             <w:fldChar w:fldCharType="separate"/>
@@ -2775,7 +2775,7 @@
             <w:fldChar w:fldCharType="begin"/>
           </w:r>
           <w:r>
-            <w:instrText xml:space="preserve"> PAGEREF _Toc22546 \h </w:instrText>
+            <w:instrText xml:space="preserve"> PAGEREF _Toc27368 \h </w:instrText>
           </w:r>
           <w:r>
             <w:fldChar w:fldCharType="separate"/>
@@ -2801,7 +2801,7 @@
             <w:fldChar w:fldCharType="begin"/>
           </w:r>
           <w:r>
-            <w:instrText xml:space="preserve"> HYPERLINK \l _Toc27374 </w:instrText>
+            <w:instrText xml:space="preserve"> HYPERLINK \l _Toc13229 </w:instrText>
           </w:r>
           <w:r>
             <w:fldChar w:fldCharType="separate"/>
@@ -2823,7 +2823,7 @@
             <w:fldChar w:fldCharType="begin"/>
           </w:r>
           <w:r>
-            <w:instrText xml:space="preserve"> PAGEREF _Toc27374 \h </w:instrText>
+            <w:instrText xml:space="preserve"> PAGEREF _Toc13229 \h </w:instrText>
           </w:r>
           <w:r>
             <w:fldChar w:fldCharType="separate"/>
@@ -2849,7 +2849,7 @@
             <w:fldChar w:fldCharType="begin"/>
           </w:r>
           <w:r>
-            <w:instrText xml:space="preserve"> HYPERLINK \l _Toc13250 </w:instrText>
+            <w:instrText xml:space="preserve"> HYPERLINK \l _Toc13283 </w:instrText>
           </w:r>
           <w:r>
             <w:fldChar w:fldCharType="separate"/>
@@ -2881,7 +2881,7 @@
             <w:fldChar w:fldCharType="begin"/>
           </w:r>
           <w:r>
-            <w:instrText xml:space="preserve"> PAGEREF _Toc13250 \h </w:instrText>
+            <w:instrText xml:space="preserve"> PAGEREF _Toc13283 \h </w:instrText>
           </w:r>
           <w:r>
             <w:fldChar w:fldCharType="separate"/>
@@ -2907,7 +2907,7 @@
             <w:fldChar w:fldCharType="begin"/>
           </w:r>
           <w:r>
-            <w:instrText xml:space="preserve"> HYPERLINK \l _Toc17275 </w:instrText>
+            <w:instrText xml:space="preserve"> HYPERLINK \l _Toc6563 </w:instrText>
           </w:r>
           <w:r>
             <w:fldChar w:fldCharType="separate"/>
@@ -2929,7 +2929,7 @@
             <w:fldChar w:fldCharType="begin"/>
           </w:r>
           <w:r>
-            <w:instrText xml:space="preserve"> PAGEREF _Toc17275 \h </w:instrText>
+            <w:instrText xml:space="preserve"> PAGEREF _Toc6563 \h </w:instrText>
           </w:r>
           <w:r>
             <w:fldChar w:fldCharType="separate"/>
@@ -2955,7 +2955,7 @@
             <w:fldChar w:fldCharType="begin"/>
           </w:r>
           <w:r>
-            <w:instrText xml:space="preserve"> HYPERLINK \l _Toc19041 </w:instrText>
+            <w:instrText xml:space="preserve"> HYPERLINK \l _Toc4972 </w:instrText>
           </w:r>
           <w:r>
             <w:fldChar w:fldCharType="separate"/>
@@ -2977,7 +2977,7 @@
             <w:fldChar w:fldCharType="begin"/>
           </w:r>
           <w:r>
-            <w:instrText xml:space="preserve"> PAGEREF _Toc19041 \h </w:instrText>
+            <w:instrText xml:space="preserve"> PAGEREF _Toc4972 \h </w:instrText>
           </w:r>
           <w:r>
             <w:fldChar w:fldCharType="separate"/>
@@ -3003,7 +3003,7 @@
             <w:fldChar w:fldCharType="begin"/>
           </w:r>
           <w:r>
-            <w:instrText xml:space="preserve"> HYPERLINK \l _Toc30063 </w:instrText>
+            <w:instrText xml:space="preserve"> HYPERLINK \l _Toc19042 </w:instrText>
           </w:r>
           <w:r>
             <w:fldChar w:fldCharType="separate"/>
@@ -3012,13 +3012,20 @@
             <w:t xml:space="preserve">10.3. </w:t>
           </w:r>
           <w:r>
+            <w:rPr>
+              <w:rFonts w:hint="default"/>
+              <w:lang w:val="vi-VN"/>
+            </w:rPr>
+            <w:t>TODO 9.3</w:t>
+          </w:r>
+          <w:r>
             <w:tab/>
           </w:r>
           <w:r>
             <w:fldChar w:fldCharType="begin"/>
           </w:r>
           <w:r>
-            <w:instrText xml:space="preserve"> PAGEREF _Toc30063 \h </w:instrText>
+            <w:instrText xml:space="preserve"> PAGEREF _Toc19042 \h </w:instrText>
           </w:r>
           <w:r>
             <w:fldChar w:fldCharType="separate"/>
@@ -3044,7 +3051,7 @@
             <w:fldChar w:fldCharType="begin"/>
           </w:r>
           <w:r>
-            <w:instrText xml:space="preserve"> HYPERLINK \l _Toc20276 </w:instrText>
+            <w:instrText xml:space="preserve"> HYPERLINK \l _Toc2111 </w:instrText>
           </w:r>
           <w:r>
             <w:fldChar w:fldCharType="separate"/>
@@ -3075,7 +3082,7 @@
             <w:fldChar w:fldCharType="begin"/>
           </w:r>
           <w:r>
-            <w:instrText xml:space="preserve"> PAGEREF _Toc20276 \h </w:instrText>
+            <w:instrText xml:space="preserve"> PAGEREF _Toc2111 \h </w:instrText>
           </w:r>
           <w:r>
             <w:fldChar w:fldCharType="separate"/>
@@ -3101,7 +3108,7 @@
             <w:fldChar w:fldCharType="begin"/>
           </w:r>
           <w:r>
-            <w:instrText xml:space="preserve"> HYPERLINK \l _Toc8842 </w:instrText>
+            <w:instrText xml:space="preserve"> HYPERLINK \l _Toc30555 </w:instrText>
           </w:r>
           <w:r>
             <w:fldChar w:fldCharType="separate"/>
@@ -3110,13 +3117,20 @@
             <w:t xml:space="preserve">11.1. </w:t>
           </w:r>
           <w:r>
+            <w:rPr>
+              <w:rFonts w:hint="default"/>
+              <w:lang w:val="vi-VN"/>
+            </w:rPr>
+            <w:t>TODO 10.1</w:t>
+          </w:r>
+          <w:r>
             <w:tab/>
           </w:r>
           <w:r>
             <w:fldChar w:fldCharType="begin"/>
           </w:r>
           <w:r>
-            <w:instrText xml:space="preserve"> PAGEREF _Toc8842 \h </w:instrText>
+            <w:instrText xml:space="preserve"> PAGEREF _Toc30555 \h </w:instrText>
           </w:r>
           <w:r>
             <w:fldChar w:fldCharType="separate"/>
@@ -3142,7 +3156,7 @@
             <w:fldChar w:fldCharType="begin"/>
           </w:r>
           <w:r>
-            <w:instrText xml:space="preserve"> HYPERLINK \l _Toc29251 </w:instrText>
+            <w:instrText xml:space="preserve"> HYPERLINK \l _Toc32034 </w:instrText>
           </w:r>
           <w:r>
             <w:fldChar w:fldCharType="separate"/>
@@ -3151,13 +3165,20 @@
             <w:t xml:space="preserve">11.2. </w:t>
           </w:r>
           <w:r>
+            <w:rPr>
+              <w:rFonts w:hint="default"/>
+              <w:lang w:val="vi-VN"/>
+            </w:rPr>
+            <w:t>TODO 10.2</w:t>
+          </w:r>
+          <w:r>
             <w:tab/>
           </w:r>
           <w:r>
             <w:fldChar w:fldCharType="begin"/>
           </w:r>
           <w:r>
-            <w:instrText xml:space="preserve"> PAGEREF _Toc29251 \h </w:instrText>
+            <w:instrText xml:space="preserve"> PAGEREF _Toc32034 \h </w:instrText>
           </w:r>
           <w:r>
             <w:fldChar w:fldCharType="separate"/>
@@ -3183,7 +3204,7 @@
             <w:fldChar w:fldCharType="begin"/>
           </w:r>
           <w:r>
-            <w:instrText xml:space="preserve"> HYPERLINK \l _Toc8921 </w:instrText>
+            <w:instrText xml:space="preserve"> HYPERLINK \l _Toc19178 </w:instrText>
           </w:r>
           <w:r>
             <w:fldChar w:fldCharType="separate"/>
@@ -3192,13 +3213,20 @@
             <w:t xml:space="preserve">11.3. </w:t>
           </w:r>
           <w:r>
+            <w:rPr>
+              <w:rFonts w:hint="default"/>
+              <w:lang w:val="vi-VN"/>
+            </w:rPr>
+            <w:t>TODO 10.3</w:t>
+          </w:r>
+          <w:r>
             <w:tab/>
           </w:r>
           <w:r>
             <w:fldChar w:fldCharType="begin"/>
           </w:r>
           <w:r>
-            <w:instrText xml:space="preserve"> PAGEREF _Toc8921 \h </w:instrText>
+            <w:instrText xml:space="preserve"> PAGEREF _Toc19178 \h </w:instrText>
           </w:r>
           <w:r>
             <w:fldChar w:fldCharType="separate"/>
@@ -3224,7 +3252,7 @@
             <w:fldChar w:fldCharType="begin"/>
           </w:r>
           <w:r>
-            <w:instrText xml:space="preserve"> HYPERLINK \l _Toc31494 </w:instrText>
+            <w:instrText xml:space="preserve"> HYPERLINK \l _Toc31465 </w:instrText>
           </w:r>
           <w:r>
             <w:fldChar w:fldCharType="separate"/>
@@ -3233,13 +3261,20 @@
             <w:t xml:space="preserve">11.4. </w:t>
           </w:r>
           <w:r>
+            <w:rPr>
+              <w:rFonts w:hint="default"/>
+              <w:lang w:val="vi-VN"/>
+            </w:rPr>
+            <w:t>TODO 10.4</w:t>
+          </w:r>
+          <w:r>
             <w:tab/>
           </w:r>
           <w:r>
             <w:fldChar w:fldCharType="begin"/>
           </w:r>
           <w:r>
-            <w:instrText xml:space="preserve"> PAGEREF _Toc31494 \h </w:instrText>
+            <w:instrText xml:space="preserve"> PAGEREF _Toc31465 \h </w:instrText>
           </w:r>
           <w:r>
             <w:fldChar w:fldCharType="separate"/>
@@ -3265,7 +3300,7 @@
             <w:fldChar w:fldCharType="begin"/>
           </w:r>
           <w:r>
-            <w:instrText xml:space="preserve"> HYPERLINK \l _Toc6434 </w:instrText>
+            <w:instrText xml:space="preserve"> HYPERLINK \l _Toc15064 </w:instrText>
           </w:r>
           <w:r>
             <w:fldChar w:fldCharType="separate"/>
@@ -3296,7 +3331,7 @@
             <w:fldChar w:fldCharType="begin"/>
           </w:r>
           <w:r>
-            <w:instrText xml:space="preserve"> PAGEREF _Toc6434 \h </w:instrText>
+            <w:instrText xml:space="preserve"> PAGEREF _Toc15064 \h </w:instrText>
           </w:r>
           <w:r>
             <w:fldChar w:fldCharType="separate"/>
@@ -3322,7 +3357,7 @@
             <w:fldChar w:fldCharType="begin"/>
           </w:r>
           <w:r>
-            <w:instrText xml:space="preserve"> HYPERLINK \l _Toc23952 </w:instrText>
+            <w:instrText xml:space="preserve"> HYPERLINK \l _Toc30581 </w:instrText>
           </w:r>
           <w:r>
             <w:fldChar w:fldCharType="separate"/>
@@ -3331,13 +3366,20 @@
             <w:t xml:space="preserve">12.1. </w:t>
           </w:r>
           <w:r>
+            <w:rPr>
+              <w:rFonts w:hint="default"/>
+              <w:lang w:val="vi-VN"/>
+            </w:rPr>
+            <w:t>TODO 11.1</w:t>
+          </w:r>
+          <w:r>
             <w:tab/>
           </w:r>
           <w:r>
             <w:fldChar w:fldCharType="begin"/>
           </w:r>
           <w:r>
-            <w:instrText xml:space="preserve"> PAGEREF _Toc23952 \h </w:instrText>
+            <w:instrText xml:space="preserve"> PAGEREF _Toc30581 \h </w:instrText>
           </w:r>
           <w:r>
             <w:fldChar w:fldCharType="separate"/>
@@ -3363,7 +3405,7 @@
             <w:fldChar w:fldCharType="begin"/>
           </w:r>
           <w:r>
-            <w:instrText xml:space="preserve"> HYPERLINK \l _Toc15348 </w:instrText>
+            <w:instrText xml:space="preserve"> HYPERLINK \l _Toc18390 </w:instrText>
           </w:r>
           <w:r>
             <w:fldChar w:fldCharType="separate"/>
@@ -3372,13 +3414,20 @@
             <w:t xml:space="preserve">12.2. </w:t>
           </w:r>
           <w:r>
+            <w:rPr>
+              <w:rFonts w:hint="default"/>
+              <w:lang w:val="vi-VN"/>
+            </w:rPr>
+            <w:t>TODO 11.2</w:t>
+          </w:r>
+          <w:r>
             <w:tab/>
           </w:r>
           <w:r>
             <w:fldChar w:fldCharType="begin"/>
           </w:r>
           <w:r>
-            <w:instrText xml:space="preserve"> PAGEREF _Toc15348 \h </w:instrText>
+            <w:instrText xml:space="preserve"> PAGEREF _Toc18390 \h </w:instrText>
           </w:r>
           <w:r>
             <w:fldChar w:fldCharType="separate"/>
@@ -3404,7 +3453,7 @@
             <w:fldChar w:fldCharType="begin"/>
           </w:r>
           <w:r>
-            <w:instrText xml:space="preserve"> HYPERLINK \l _Toc17908 </w:instrText>
+            <w:instrText xml:space="preserve"> HYPERLINK \l _Toc4540 </w:instrText>
           </w:r>
           <w:r>
             <w:fldChar w:fldCharType="separate"/>
@@ -3413,13 +3462,20 @@
             <w:t xml:space="preserve">12.3. </w:t>
           </w:r>
           <w:r>
+            <w:rPr>
+              <w:rFonts w:hint="default"/>
+              <w:lang w:val="vi-VN"/>
+            </w:rPr>
+            <w:t>TODO 11.3</w:t>
+          </w:r>
+          <w:r>
             <w:tab/>
           </w:r>
           <w:r>
             <w:fldChar w:fldCharType="begin"/>
           </w:r>
           <w:r>
-            <w:instrText xml:space="preserve"> PAGEREF _Toc17908 \h </w:instrText>
+            <w:instrText xml:space="preserve"> PAGEREF _Toc4540 \h </w:instrText>
           </w:r>
           <w:r>
             <w:fldChar w:fldCharType="separate"/>
@@ -3468,7 +3524,7 @@
           <w:numId w:val="6"/>
         </w:numPr>
       </w:pPr>
-      <w:bookmarkStart w:id="0" w:name="_Toc29359"/>
+      <w:bookmarkStart w:id="0" w:name="_Toc25403"/>
       <w:r>
         <w:t>F0 – Hạ tầng và khởi tạo project</w:t>
       </w:r>
@@ -3482,7 +3538,7 @@
           <w:numId w:val="6"/>
         </w:numPr>
       </w:pPr>
-      <w:bookmarkStart w:id="1" w:name="_Toc31744"/>
+      <w:bookmarkStart w:id="1" w:name="_Toc1795"/>
       <w:r>
         <w:t>TODO 0.1</w:t>
       </w:r>
@@ -3610,7 +3666,7 @@
           <w:numId w:val="6"/>
         </w:numPr>
       </w:pPr>
-      <w:bookmarkStart w:id="2" w:name="_Toc2816"/>
+      <w:bookmarkStart w:id="2" w:name="_Toc16293"/>
       <w:r>
         <w:rPr>
           <w:rFonts w:eastAsiaTheme="majorEastAsia" w:cstheme="majorBidi"/>
@@ -3751,7 +3807,7 @@
           <w:numId w:val="6"/>
         </w:numPr>
       </w:pPr>
-      <w:bookmarkStart w:id="3" w:name="_Toc22232"/>
+      <w:bookmarkStart w:id="3" w:name="_Toc29956"/>
       <w:r>
         <w:t>TODO 0.3</w:t>
       </w:r>
@@ -3883,7 +3939,7 @@
           <w:numId w:val="6"/>
         </w:numPr>
       </w:pPr>
-      <w:bookmarkStart w:id="4" w:name="_Toc23480"/>
+      <w:bookmarkStart w:id="4" w:name="_Toc5512"/>
       <w:r>
         <w:t>TODO 0.4</w:t>
       </w:r>
@@ -4009,7 +4065,7 @@
           <w:numId w:val="6"/>
         </w:numPr>
       </w:pPr>
-      <w:bookmarkStart w:id="5" w:name="_Toc23312"/>
+      <w:bookmarkStart w:id="5" w:name="_Toc5831"/>
       <w:r>
         <w:t>TODO 0.</w:t>
       </w:r>
@@ -4131,7 +4187,7 @@
           <w:numId w:val="6"/>
         </w:numPr>
       </w:pPr>
-      <w:bookmarkStart w:id="6" w:name="_Toc7569"/>
+      <w:bookmarkStart w:id="6" w:name="_Toc15512"/>
       <w:r>
         <w:t>TODO 0.</w:t>
       </w:r>
@@ -4257,7 +4313,7 @@
           <w:numId w:val="6"/>
         </w:numPr>
       </w:pPr>
-      <w:bookmarkStart w:id="7" w:name="_Toc5413"/>
+      <w:bookmarkStart w:id="7" w:name="_Toc6318"/>
       <w:r>
         <w:t xml:space="preserve">F1- </w:t>
       </w:r>
@@ -4283,7 +4339,7 @@
           <w:numId w:val="6"/>
         </w:numPr>
       </w:pPr>
-      <w:bookmarkStart w:id="8" w:name="_Toc12053"/>
+      <w:bookmarkStart w:id="8" w:name="_Toc32063"/>
       <w:r>
         <w:t xml:space="preserve">TODO </w:t>
       </w:r>
@@ -4349,6 +4405,7 @@
       <w:pPr>
         <w:pStyle w:val="25"/>
         <w:numPr>
+          <w:ilvl w:val="0"/>
           <w:numId w:val="0"/>
         </w:numPr>
         <w:spacing w:before="60" w:after="60" w:line="312" w:lineRule="auto"/>
@@ -4410,7 +4467,7 @@
           <w:numId w:val="6"/>
         </w:numPr>
       </w:pPr>
-      <w:bookmarkStart w:id="9" w:name="_Toc25968"/>
+      <w:bookmarkStart w:id="9" w:name="_Toc193"/>
       <w:r>
         <w:t xml:space="preserve">TODO </w:t>
       </w:r>
@@ -4533,7 +4590,7 @@
           <w:numId w:val="6"/>
         </w:numPr>
       </w:pPr>
-      <w:bookmarkStart w:id="10" w:name="_Toc25417"/>
+      <w:bookmarkStart w:id="10" w:name="_Toc20360"/>
       <w:r>
         <w:t xml:space="preserve">TODO </w:t>
       </w:r>
@@ -4603,6 +4660,7 @@
       <w:pPr>
         <w:pStyle w:val="25"/>
         <w:numPr>
+          <w:ilvl w:val="0"/>
           <w:numId w:val="0"/>
         </w:numPr>
         <w:spacing w:before="60" w:after="60" w:line="312" w:lineRule="auto"/>
@@ -4664,7 +4722,7 @@
           <w:numId w:val="6"/>
         </w:numPr>
       </w:pPr>
-      <w:bookmarkStart w:id="11" w:name="_Toc16047"/>
+      <w:bookmarkStart w:id="11" w:name="_Toc20606"/>
       <w:r>
         <w:t xml:space="preserve">TODO </w:t>
       </w:r>
@@ -4734,6 +4792,7 @@
       <w:pPr>
         <w:pStyle w:val="25"/>
         <w:numPr>
+          <w:ilvl w:val="0"/>
           <w:numId w:val="0"/>
         </w:numPr>
         <w:spacing w:before="60" w:after="60" w:line="312" w:lineRule="auto"/>
@@ -4795,7 +4854,7 @@
           <w:numId w:val="6"/>
         </w:numPr>
       </w:pPr>
-      <w:bookmarkStart w:id="12" w:name="_Toc18073"/>
+      <w:bookmarkStart w:id="12" w:name="_Toc23084"/>
       <w:r>
         <w:t xml:space="preserve">TODO </w:t>
       </w:r>
@@ -4862,6 +4921,7 @@
       <w:pPr>
         <w:pStyle w:val="25"/>
         <w:numPr>
+          <w:ilvl w:val="0"/>
           <w:numId w:val="0"/>
         </w:numPr>
         <w:spacing w:before="60" w:after="60" w:line="312" w:lineRule="auto"/>
@@ -4920,7 +4980,7 @@
           <w:numId w:val="6"/>
         </w:numPr>
       </w:pPr>
-      <w:bookmarkStart w:id="13" w:name="_Toc21944"/>
+      <w:bookmarkStart w:id="13" w:name="_Toc23071"/>
       <w:r>
         <w:t>F</w:t>
       </w:r>
@@ -4950,7 +5010,7 @@
           <w:numId w:val="6"/>
         </w:numPr>
       </w:pPr>
-      <w:bookmarkStart w:id="14" w:name="_Toc5170"/>
+      <w:bookmarkStart w:id="14" w:name="_Toc31552"/>
       <w:r>
         <w:t xml:space="preserve">TODO </w:t>
       </w:r>
@@ -5024,6 +5084,7 @@
       <w:pPr>
         <w:pStyle w:val="25"/>
         <w:numPr>
+          <w:ilvl w:val="0"/>
           <w:numId w:val="0"/>
         </w:numPr>
         <w:rPr>
@@ -5089,7 +5150,7 @@
           <w:numId w:val="6"/>
         </w:numPr>
       </w:pPr>
-      <w:bookmarkStart w:id="15" w:name="_Toc13293"/>
+      <w:bookmarkStart w:id="15" w:name="_Toc3364"/>
       <w:r>
         <w:t xml:space="preserve">TODO </w:t>
       </w:r>
@@ -5212,7 +5273,7 @@
           <w:numId w:val="6"/>
         </w:numPr>
       </w:pPr>
-      <w:bookmarkStart w:id="16" w:name="_Toc10036"/>
+      <w:bookmarkStart w:id="16" w:name="_Toc12051"/>
       <w:r>
         <w:rPr>
           <w:rFonts w:hint="default"/>
@@ -5269,6 +5330,7 @@
       <w:pPr>
         <w:pStyle w:val="25"/>
         <w:numPr>
+          <w:ilvl w:val="0"/>
           <w:numId w:val="0"/>
         </w:numPr>
         <w:spacing w:before="60" w:after="60" w:line="312" w:lineRule="auto"/>
@@ -5330,7 +5392,7 @@
           <w:numId w:val="6"/>
         </w:numPr>
       </w:pPr>
-      <w:bookmarkStart w:id="17" w:name="_Toc27177"/>
+      <w:bookmarkStart w:id="17" w:name="_Toc23590"/>
       <w:r>
         <w:rPr>
           <w:rFonts w:hint="default"/>
@@ -5387,6 +5449,7 @@
       <w:pPr>
         <w:pStyle w:val="25"/>
         <w:numPr>
+          <w:ilvl w:val="0"/>
           <w:numId w:val="0"/>
         </w:numPr>
         <w:spacing w:before="60" w:after="60" w:line="312" w:lineRule="auto"/>
@@ -5448,7 +5511,7 @@
           <w:numId w:val="6"/>
         </w:numPr>
       </w:pPr>
-      <w:bookmarkStart w:id="18" w:name="_Toc20060"/>
+      <w:bookmarkStart w:id="18" w:name="_Toc3900"/>
       <w:r>
         <w:rPr>
           <w:rFonts w:hint="default"/>
@@ -5506,6 +5569,7 @@
       <w:pPr>
         <w:pStyle w:val="25"/>
         <w:numPr>
+          <w:ilvl w:val="0"/>
           <w:numId w:val="0"/>
         </w:numPr>
         <w:spacing w:before="60" w:after="60" w:line="312" w:lineRule="auto"/>
@@ -5568,7 +5632,7 @@
           <w:numId w:val="6"/>
         </w:numPr>
       </w:pPr>
-      <w:bookmarkStart w:id="19" w:name="_Toc20542"/>
+      <w:bookmarkStart w:id="19" w:name="_Toc11834"/>
       <w:r>
         <w:rPr>
           <w:rFonts w:hint="default"/>
@@ -5626,6 +5690,7 @@
       <w:pPr>
         <w:pStyle w:val="25"/>
         <w:numPr>
+          <w:ilvl w:val="0"/>
           <w:numId w:val="0"/>
         </w:numPr>
         <w:spacing w:before="60" w:after="60" w:line="312" w:lineRule="auto"/>
@@ -5684,6 +5749,7 @@
       <w:pPr>
         <w:pStyle w:val="25"/>
         <w:numPr>
+          <w:ilvl w:val="0"/>
           <w:numId w:val="0"/>
         </w:numPr>
         <w:spacing w:before="60" w:after="60" w:line="312" w:lineRule="auto"/>
@@ -5703,7 +5769,7 @@
           <w:numId w:val="6"/>
         </w:numPr>
       </w:pPr>
-      <w:bookmarkStart w:id="20" w:name="_Toc24087"/>
+      <w:bookmarkStart w:id="20" w:name="_Toc13040"/>
       <w:r>
         <w:t>F</w:t>
       </w:r>
@@ -5733,7 +5799,7 @@
           <w:numId w:val="6"/>
         </w:numPr>
       </w:pPr>
-      <w:bookmarkStart w:id="21" w:name="_Toc23870"/>
+      <w:bookmarkStart w:id="21" w:name="_Toc8300"/>
       <w:r>
         <w:t xml:space="preserve">TODO </w:t>
       </w:r>
@@ -5793,6 +5859,7 @@
       <w:pPr>
         <w:pStyle w:val="25"/>
         <w:numPr>
+          <w:ilvl w:val="0"/>
           <w:numId w:val="0"/>
         </w:numPr>
         <w:spacing w:before="60" w:after="60" w:line="312" w:lineRule="auto"/>
@@ -5854,7 +5921,7 @@
           <w:numId w:val="6"/>
         </w:numPr>
       </w:pPr>
-      <w:bookmarkStart w:id="22" w:name="_Toc31778"/>
+      <w:bookmarkStart w:id="22" w:name="_Toc17166"/>
       <w:r>
         <w:rPr>
           <w:rFonts w:hint="default"/>
@@ -5908,6 +5975,7 @@
       <w:pPr>
         <w:pStyle w:val="25"/>
         <w:numPr>
+          <w:ilvl w:val="0"/>
           <w:numId w:val="0"/>
         </w:numPr>
         <w:spacing w:before="60" w:after="60" w:line="312" w:lineRule="auto"/>
@@ -5966,7 +6034,7 @@
           <w:numId w:val="6"/>
         </w:numPr>
       </w:pPr>
-      <w:bookmarkStart w:id="23" w:name="_Toc18208"/>
+      <w:bookmarkStart w:id="23" w:name="_Toc16412"/>
       <w:r>
         <w:rPr>
           <w:rFonts w:hint="default"/>
@@ -6023,6 +6091,7 @@
       <w:pPr>
         <w:pStyle w:val="25"/>
         <w:numPr>
+          <w:ilvl w:val="0"/>
           <w:numId w:val="0"/>
         </w:numPr>
         <w:spacing w:before="60" w:after="60" w:line="312" w:lineRule="auto"/>
@@ -6084,7 +6153,7 @@
           <w:numId w:val="6"/>
         </w:numPr>
       </w:pPr>
-      <w:bookmarkStart w:id="24" w:name="_Toc14617"/>
+      <w:bookmarkStart w:id="24" w:name="_Toc26499"/>
       <w:r>
         <w:t>F</w:t>
       </w:r>
@@ -6121,7 +6190,7 @@
         </w:rPr>
         <w:t xml:space="preserve"> </w:t>
       </w:r>
-      <w:bookmarkStart w:id="25" w:name="_Toc19587"/>
+      <w:bookmarkStart w:id="25" w:name="_Toc27975"/>
       <w:r>
         <w:rPr>
           <w:rFonts w:hint="default"/>
@@ -6178,6 +6247,7 @@
       <w:pPr>
         <w:pStyle w:val="25"/>
         <w:numPr>
+          <w:ilvl w:val="0"/>
           <w:numId w:val="0"/>
         </w:numPr>
         <w:spacing w:before="60" w:after="60" w:line="312" w:lineRule="auto"/>
@@ -6239,7 +6309,7 @@
           <w:numId w:val="6"/>
         </w:numPr>
       </w:pPr>
-      <w:bookmarkStart w:id="26" w:name="_Toc28590"/>
+      <w:bookmarkStart w:id="26" w:name="_Toc8448"/>
       <w:r>
         <w:rPr>
           <w:rFonts w:hint="default"/>
@@ -6293,6 +6363,7 @@
       <w:pPr>
         <w:pStyle w:val="25"/>
         <w:numPr>
+          <w:ilvl w:val="0"/>
           <w:numId w:val="0"/>
         </w:numPr>
         <w:spacing w:before="60" w:after="60" w:line="312" w:lineRule="auto"/>
@@ -6351,7 +6422,7 @@
           <w:numId w:val="6"/>
         </w:numPr>
       </w:pPr>
-      <w:bookmarkStart w:id="27" w:name="_Toc24994"/>
+      <w:bookmarkStart w:id="27" w:name="_Toc19450"/>
       <w:r>
         <w:rPr>
           <w:rFonts w:hint="default"/>
@@ -6408,6 +6479,7 @@
       <w:pPr>
         <w:pStyle w:val="25"/>
         <w:numPr>
+          <w:ilvl w:val="0"/>
           <w:numId w:val="0"/>
         </w:numPr>
         <w:spacing w:before="60" w:after="60" w:line="312" w:lineRule="auto"/>
@@ -6469,7 +6541,7 @@
           <w:numId w:val="6"/>
         </w:numPr>
       </w:pPr>
-      <w:bookmarkStart w:id="28" w:name="_Toc24154"/>
+      <w:bookmarkStart w:id="28" w:name="_Toc30988"/>
       <w:r>
         <w:rPr>
           <w:rFonts w:hint="default"/>
@@ -6523,6 +6595,7 @@
       <w:pPr>
         <w:pStyle w:val="25"/>
         <w:numPr>
+          <w:ilvl w:val="0"/>
           <w:numId w:val="0"/>
         </w:numPr>
         <w:spacing w:before="60" w:after="60" w:line="312" w:lineRule="auto"/>
@@ -6581,7 +6654,7 @@
           <w:numId w:val="6"/>
         </w:numPr>
       </w:pPr>
-      <w:bookmarkStart w:id="29" w:name="_Toc426"/>
+      <w:bookmarkStart w:id="29" w:name="_Toc9861"/>
       <w:r>
         <w:t>F</w:t>
       </w:r>
@@ -6611,7 +6684,7 @@
           <w:numId w:val="6"/>
         </w:numPr>
       </w:pPr>
-      <w:bookmarkStart w:id="30" w:name="_Toc22464"/>
+      <w:bookmarkStart w:id="30" w:name="_Toc1019"/>
       <w:r>
         <w:rPr>
           <w:rFonts w:hint="default"/>
@@ -6668,6 +6741,7 @@
       <w:pPr>
         <w:pStyle w:val="25"/>
         <w:numPr>
+          <w:ilvl w:val="0"/>
           <w:numId w:val="0"/>
         </w:numPr>
         <w:spacing w:before="60" w:after="60" w:line="312" w:lineRule="auto"/>
@@ -6729,7 +6803,7 @@
           <w:numId w:val="6"/>
         </w:numPr>
       </w:pPr>
-      <w:bookmarkStart w:id="31" w:name="_Toc12316"/>
+      <w:bookmarkStart w:id="31" w:name="_Toc28203"/>
       <w:r>
         <w:rPr>
           <w:rFonts w:hint="default"/>
@@ -6783,6 +6857,7 @@
       <w:pPr>
         <w:pStyle w:val="25"/>
         <w:numPr>
+          <w:ilvl w:val="0"/>
           <w:numId w:val="0"/>
         </w:numPr>
         <w:spacing w:before="60" w:after="60" w:line="312" w:lineRule="auto"/>
@@ -6841,7 +6916,7 @@
           <w:numId w:val="6"/>
         </w:numPr>
       </w:pPr>
-      <w:bookmarkStart w:id="32" w:name="_Toc1830"/>
+      <w:bookmarkStart w:id="32" w:name="_Toc19284"/>
       <w:r>
         <w:rPr>
           <w:rFonts w:hint="default"/>
@@ -6898,6 +6973,7 @@
       <w:pPr>
         <w:pStyle w:val="25"/>
         <w:numPr>
+          <w:ilvl w:val="0"/>
           <w:numId w:val="0"/>
         </w:numPr>
         <w:spacing w:before="60" w:after="60" w:line="312" w:lineRule="auto"/>
@@ -6959,7 +7035,7 @@
           <w:numId w:val="6"/>
         </w:numPr>
       </w:pPr>
-      <w:bookmarkStart w:id="33" w:name="_Toc20956"/>
+      <w:bookmarkStart w:id="33" w:name="_Toc13917"/>
       <w:r>
         <w:rPr>
           <w:rFonts w:hint="default"/>
@@ -7013,6 +7089,7 @@
       <w:pPr>
         <w:pStyle w:val="25"/>
         <w:numPr>
+          <w:ilvl w:val="0"/>
           <w:numId w:val="0"/>
         </w:numPr>
         <w:spacing w:before="60" w:after="60" w:line="312" w:lineRule="auto"/>
@@ -7071,7 +7148,7 @@
           <w:numId w:val="6"/>
         </w:numPr>
       </w:pPr>
-      <w:bookmarkStart w:id="34" w:name="_Toc29098"/>
+      <w:bookmarkStart w:id="34" w:name="_Toc11431"/>
       <w:r>
         <w:t>F</w:t>
       </w:r>
@@ -7108,7 +7185,7 @@
         </w:rPr>
         <w:t xml:space="preserve"> </w:t>
       </w:r>
-      <w:bookmarkStart w:id="35" w:name="_Toc1053"/>
+      <w:bookmarkStart w:id="35" w:name="_Toc9924"/>
       <w:r>
         <w:rPr>
           <w:rFonts w:hint="default"/>
@@ -7165,6 +7242,7 @@
       <w:pPr>
         <w:pStyle w:val="25"/>
         <w:numPr>
+          <w:ilvl w:val="0"/>
           <w:numId w:val="0"/>
         </w:numPr>
         <w:spacing w:before="60" w:after="60" w:line="312" w:lineRule="auto"/>
@@ -7226,7 +7304,7 @@
           <w:numId w:val="6"/>
         </w:numPr>
       </w:pPr>
-      <w:bookmarkStart w:id="36" w:name="_Toc25116"/>
+      <w:bookmarkStart w:id="36" w:name="_Toc22508"/>
       <w:r>
         <w:rPr>
           <w:rFonts w:hint="default"/>
@@ -7280,6 +7358,7 @@
       <w:pPr>
         <w:pStyle w:val="25"/>
         <w:numPr>
+          <w:ilvl w:val="0"/>
           <w:numId w:val="0"/>
         </w:numPr>
         <w:spacing w:before="60" w:after="60" w:line="312" w:lineRule="auto"/>
@@ -7349,7 +7428,7 @@
           <w:numId w:val="6"/>
         </w:numPr>
       </w:pPr>
-      <w:bookmarkStart w:id="37" w:name="_Toc1869"/>
+      <w:bookmarkStart w:id="37" w:name="_Toc678"/>
       <w:r>
         <w:rPr>
           <w:rFonts w:hint="default"/>
@@ -7406,6 +7485,7 @@
       <w:pPr>
         <w:pStyle w:val="25"/>
         <w:numPr>
+          <w:ilvl w:val="0"/>
           <w:numId w:val="0"/>
         </w:numPr>
         <w:spacing w:before="60" w:after="60" w:line="312" w:lineRule="auto"/>
@@ -7467,7 +7547,7 @@
           <w:numId w:val="6"/>
         </w:numPr>
       </w:pPr>
-      <w:bookmarkStart w:id="38" w:name="_Toc7328"/>
+      <w:bookmarkStart w:id="38" w:name="_Toc12756"/>
       <w:r>
         <w:rPr>
           <w:rFonts w:hint="default"/>
@@ -7524,6 +7604,7 @@
       <w:pPr>
         <w:pStyle w:val="25"/>
         <w:numPr>
+          <w:ilvl w:val="0"/>
           <w:numId w:val="0"/>
         </w:numPr>
         <w:spacing w:before="60" w:after="60" w:line="312" w:lineRule="auto"/>
@@ -7585,7 +7666,7 @@
           <w:numId w:val="6"/>
         </w:numPr>
       </w:pPr>
-      <w:bookmarkStart w:id="39" w:name="_Toc18085"/>
+      <w:bookmarkStart w:id="39" w:name="_Toc6250"/>
       <w:r>
         <w:rPr>
           <w:rFonts w:hint="default"/>
@@ -7639,6 +7720,7 @@
       <w:pPr>
         <w:pStyle w:val="25"/>
         <w:numPr>
+          <w:ilvl w:val="0"/>
           <w:numId w:val="0"/>
         </w:numPr>
         <w:spacing w:before="60" w:after="60" w:line="312" w:lineRule="auto"/>
@@ -7697,7 +7779,7 @@
           <w:numId w:val="6"/>
         </w:numPr>
       </w:pPr>
-      <w:bookmarkStart w:id="40" w:name="_Toc24719"/>
+      <w:bookmarkStart w:id="40" w:name="_Toc16825"/>
       <w:r>
         <w:t>F</w:t>
       </w:r>
@@ -7734,7 +7816,7 @@
         </w:rPr>
         <w:t xml:space="preserve"> </w:t>
       </w:r>
-      <w:bookmarkStart w:id="41" w:name="_Toc2323"/>
+      <w:bookmarkStart w:id="41" w:name="_Toc16967"/>
       <w:r>
         <w:rPr>
           <w:rFonts w:hint="default"/>
@@ -7791,6 +7873,7 @@
       <w:pPr>
         <w:pStyle w:val="25"/>
         <w:numPr>
+          <w:ilvl w:val="0"/>
           <w:numId w:val="0"/>
         </w:numPr>
         <w:spacing w:before="60" w:after="60" w:line="312" w:lineRule="auto"/>
@@ -7852,7 +7935,7 @@
           <w:numId w:val="6"/>
         </w:numPr>
       </w:pPr>
-      <w:bookmarkStart w:id="42" w:name="_Toc12846"/>
+      <w:bookmarkStart w:id="42" w:name="_Toc20505"/>
       <w:r>
         <w:rPr>
           <w:rFonts w:hint="default"/>
@@ -7906,6 +7989,7 @@
       <w:pPr>
         <w:pStyle w:val="25"/>
         <w:numPr>
+          <w:ilvl w:val="0"/>
           <w:numId w:val="0"/>
         </w:numPr>
         <w:spacing w:before="60" w:after="60" w:line="312" w:lineRule="auto"/>
@@ -7964,7 +8048,7 @@
           <w:numId w:val="6"/>
         </w:numPr>
       </w:pPr>
-      <w:bookmarkStart w:id="43" w:name="_Toc32404"/>
+      <w:bookmarkStart w:id="43" w:name="_Toc10596"/>
       <w:r>
         <w:rPr>
           <w:rFonts w:hint="default"/>
@@ -8021,6 +8105,7 @@
       <w:pPr>
         <w:pStyle w:val="25"/>
         <w:numPr>
+          <w:ilvl w:val="0"/>
           <w:numId w:val="0"/>
         </w:numPr>
         <w:spacing w:before="60" w:after="60" w:line="312" w:lineRule="auto"/>
@@ -8082,7 +8167,7 @@
           <w:numId w:val="6"/>
         </w:numPr>
       </w:pPr>
-      <w:bookmarkStart w:id="44" w:name="_Toc29484"/>
+      <w:bookmarkStart w:id="44" w:name="_Toc16817"/>
       <w:r>
         <w:rPr>
           <w:rFonts w:hint="default"/>
@@ -8139,6 +8224,7 @@
       <w:pPr>
         <w:pStyle w:val="25"/>
         <w:numPr>
+          <w:ilvl w:val="0"/>
           <w:numId w:val="0"/>
         </w:numPr>
         <w:spacing w:before="60" w:after="60" w:line="312" w:lineRule="auto"/>
@@ -8200,7 +8286,7 @@
           <w:numId w:val="6"/>
         </w:numPr>
       </w:pPr>
-      <w:bookmarkStart w:id="45" w:name="_Toc13624"/>
+      <w:bookmarkStart w:id="45" w:name="_Toc18159"/>
       <w:r>
         <w:rPr>
           <w:rFonts w:hint="default"/>
@@ -8254,6 +8340,7 @@
       <w:pPr>
         <w:pStyle w:val="25"/>
         <w:numPr>
+          <w:ilvl w:val="0"/>
           <w:numId w:val="0"/>
         </w:numPr>
         <w:spacing w:before="60" w:after="60" w:line="312" w:lineRule="auto"/>
@@ -8312,7 +8399,7 @@
           <w:numId w:val="6"/>
         </w:numPr>
       </w:pPr>
-      <w:bookmarkStart w:id="46" w:name="_Toc18442"/>
+      <w:bookmarkStart w:id="46" w:name="_Toc23738"/>
       <w:r>
         <w:rPr>
           <w:rFonts w:hint="default"/>
@@ -8369,6 +8456,7 @@
       <w:pPr>
         <w:pStyle w:val="25"/>
         <w:numPr>
+          <w:ilvl w:val="0"/>
           <w:numId w:val="0"/>
         </w:numPr>
         <w:spacing w:before="60" w:after="60" w:line="312" w:lineRule="auto"/>
@@ -8430,7 +8518,7 @@
           <w:numId w:val="6"/>
         </w:numPr>
       </w:pPr>
-      <w:bookmarkStart w:id="47" w:name="_Toc7011"/>
+      <w:bookmarkStart w:id="47" w:name="_Toc15092"/>
       <w:r>
         <w:rPr>
           <w:rFonts w:hint="default"/>
@@ -8484,6 +8572,7 @@
       <w:pPr>
         <w:pStyle w:val="25"/>
         <w:numPr>
+          <w:ilvl w:val="0"/>
           <w:numId w:val="0"/>
         </w:numPr>
         <w:spacing w:before="60" w:after="60" w:line="312" w:lineRule="auto"/>
@@ -8542,7 +8631,7 @@
           <w:numId w:val="6"/>
         </w:numPr>
       </w:pPr>
-      <w:bookmarkStart w:id="48" w:name="_Toc31197"/>
+      <w:bookmarkStart w:id="48" w:name="_Toc20703"/>
       <w:r>
         <w:t>F</w:t>
       </w:r>
@@ -8572,7 +8661,7 @@
           <w:numId w:val="6"/>
         </w:numPr>
       </w:pPr>
-      <w:bookmarkStart w:id="49" w:name="_Toc8462"/>
+      <w:bookmarkStart w:id="49" w:name="_Toc3846"/>
       <w:r>
         <w:rPr>
           <w:rFonts w:hint="default"/>
@@ -8629,6 +8718,7 @@
       <w:pPr>
         <w:pStyle w:val="25"/>
         <w:numPr>
+          <w:ilvl w:val="0"/>
           <w:numId w:val="0"/>
         </w:numPr>
         <w:spacing w:before="60" w:after="60" w:line="312" w:lineRule="auto"/>
@@ -8690,7 +8780,7 @@
           <w:numId w:val="6"/>
         </w:numPr>
       </w:pPr>
-      <w:bookmarkStart w:id="50" w:name="_Toc16140"/>
+      <w:bookmarkStart w:id="50" w:name="_Toc24527"/>
       <w:r>
         <w:rPr>
           <w:rFonts w:hint="default"/>
@@ -8744,6 +8834,7 @@
       <w:pPr>
         <w:pStyle w:val="25"/>
         <w:numPr>
+          <w:ilvl w:val="0"/>
           <w:numId w:val="0"/>
         </w:numPr>
         <w:spacing w:before="60" w:after="60" w:line="312" w:lineRule="auto"/>
@@ -8802,7 +8893,7 @@
           <w:numId w:val="6"/>
         </w:numPr>
       </w:pPr>
-      <w:bookmarkStart w:id="51" w:name="_Toc22546"/>
+      <w:bookmarkStart w:id="51" w:name="_Toc27368"/>
       <w:r>
         <w:rPr>
           <w:rFonts w:hint="default"/>
@@ -8859,6 +8950,7 @@
       <w:pPr>
         <w:pStyle w:val="25"/>
         <w:numPr>
+          <w:ilvl w:val="0"/>
           <w:numId w:val="0"/>
         </w:numPr>
         <w:spacing w:before="60" w:after="60" w:line="312" w:lineRule="auto"/>
@@ -8920,7 +9012,7 @@
           <w:numId w:val="6"/>
         </w:numPr>
       </w:pPr>
-      <w:bookmarkStart w:id="52" w:name="_Toc27374"/>
+      <w:bookmarkStart w:id="52" w:name="_Toc13229"/>
       <w:r>
         <w:rPr>
           <w:rFonts w:hint="default"/>
@@ -8977,6 +9069,7 @@
       <w:pPr>
         <w:pStyle w:val="25"/>
         <w:numPr>
+          <w:ilvl w:val="0"/>
           <w:numId w:val="0"/>
         </w:numPr>
         <w:spacing w:before="60" w:after="60" w:line="312" w:lineRule="auto"/>
@@ -9045,7 +9138,7 @@
         </w:rPr>
         <w:t xml:space="preserve"> </w:t>
       </w:r>
-      <w:bookmarkStart w:id="53" w:name="_Toc13250"/>
+      <w:bookmarkStart w:id="53" w:name="_Toc13283"/>
       <w:r>
         <w:t>F</w:t>
       </w:r>
@@ -9076,7 +9169,7 @@
           <w:numId w:val="6"/>
         </w:numPr>
       </w:pPr>
-      <w:bookmarkStart w:id="54" w:name="_Toc17275"/>
+      <w:bookmarkStart w:id="54" w:name="_Toc6563"/>
       <w:r>
         <w:rPr>
           <w:rFonts w:hint="default"/>
@@ -9133,6 +9226,7 @@
       <w:pPr>
         <w:pStyle w:val="25"/>
         <w:numPr>
+          <w:ilvl w:val="0"/>
           <w:numId w:val="0"/>
         </w:numPr>
         <w:spacing w:before="60" w:after="60" w:line="312" w:lineRule="auto"/>
@@ -9194,7 +9288,7 @@
           <w:numId w:val="6"/>
         </w:numPr>
       </w:pPr>
-      <w:bookmarkStart w:id="55" w:name="_Toc19041"/>
+      <w:bookmarkStart w:id="55" w:name="_Toc4972"/>
       <w:r>
         <w:rPr>
           <w:rFonts w:hint="default"/>
@@ -9248,6 +9342,7 @@
       <w:pPr>
         <w:pStyle w:val="25"/>
         <w:numPr>
+          <w:ilvl w:val="0"/>
           <w:numId w:val="0"/>
         </w:numPr>
         <w:spacing w:before="60" w:after="60" w:line="312" w:lineRule="auto"/>
@@ -9306,15 +9401,15 @@
           <w:numId w:val="6"/>
         </w:numPr>
       </w:pPr>
-      <w:bookmarkStart w:id="56" w:name="_Toc30063"/>
+      <w:bookmarkStart w:id="56" w:name="_Toc19042"/>
+      <w:r>
+        <w:rPr>
+          <w:rFonts w:hint="default"/>
+          <w:lang w:val="vi-VN"/>
+        </w:rPr>
+        <w:t>TODO 9.3</w:t>
+      </w:r>
       <w:bookmarkEnd w:id="56"/>
-      <w:r>
-        <w:rPr>
-          <w:rFonts w:hint="default"/>
-          <w:lang w:val="vi-VN"/>
-        </w:rPr>
-        <w:t>TODO 9.3</w:t>
-      </w:r>
     </w:p>
     <w:p>
       <w:pPr>
@@ -9363,6 +9458,7 @@
       <w:pPr>
         <w:pStyle w:val="25"/>
         <w:numPr>
+          <w:ilvl w:val="0"/>
           <w:numId w:val="0"/>
         </w:numPr>
         <w:spacing w:before="60" w:after="60" w:line="312" w:lineRule="auto"/>
@@ -9431,7 +9527,7 @@
         </w:rPr>
         <w:t xml:space="preserve"> </w:t>
       </w:r>
-      <w:bookmarkStart w:id="57" w:name="_Toc20276"/>
+      <w:bookmarkStart w:id="57" w:name="_Toc2111"/>
       <w:r>
         <w:t>F</w:t>
       </w:r>
@@ -9461,15 +9557,15 @@
           <w:numId w:val="6"/>
         </w:numPr>
       </w:pPr>
-      <w:bookmarkStart w:id="58" w:name="_Toc8842"/>
+      <w:bookmarkStart w:id="58" w:name="_Toc30555"/>
+      <w:r>
+        <w:rPr>
+          <w:rFonts w:hint="default"/>
+          <w:lang w:val="vi-VN"/>
+        </w:rPr>
+        <w:t>TODO 10.1</w:t>
+      </w:r>
       <w:bookmarkEnd w:id="58"/>
-      <w:r>
-        <w:rPr>
-          <w:rFonts w:hint="default"/>
-          <w:lang w:val="vi-VN"/>
-        </w:rPr>
-        <w:t>TODO 10.1</w:t>
-      </w:r>
     </w:p>
     <w:p>
       <w:pPr>
@@ -9518,6 +9614,7 @@
       <w:pPr>
         <w:pStyle w:val="25"/>
         <w:numPr>
+          <w:ilvl w:val="0"/>
           <w:numId w:val="0"/>
         </w:numPr>
         <w:spacing w:before="60" w:after="60" w:line="312" w:lineRule="auto"/>
@@ -9579,15 +9676,15 @@
           <w:numId w:val="6"/>
         </w:numPr>
       </w:pPr>
-      <w:bookmarkStart w:id="59" w:name="_Toc29251"/>
+      <w:bookmarkStart w:id="59" w:name="_Toc32034"/>
+      <w:r>
+        <w:rPr>
+          <w:rFonts w:hint="default"/>
+          <w:lang w:val="vi-VN"/>
+        </w:rPr>
+        <w:t>TODO 10.2</w:t>
+      </w:r>
       <w:bookmarkEnd w:id="59"/>
-      <w:r>
-        <w:rPr>
-          <w:rFonts w:hint="default"/>
-          <w:lang w:val="vi-VN"/>
-        </w:rPr>
-        <w:t>TODO 10.2</w:t>
-      </w:r>
     </w:p>
     <w:p>
       <w:pPr>
@@ -9633,6 +9730,7 @@
       <w:pPr>
         <w:pStyle w:val="25"/>
         <w:numPr>
+          <w:ilvl w:val="0"/>
           <w:numId w:val="0"/>
         </w:numPr>
         <w:spacing w:before="60" w:after="60" w:line="312" w:lineRule="auto"/>
@@ -9691,15 +9789,15 @@
           <w:numId w:val="6"/>
         </w:numPr>
       </w:pPr>
-      <w:bookmarkStart w:id="60" w:name="_Toc8921"/>
+      <w:bookmarkStart w:id="60" w:name="_Toc19178"/>
+      <w:r>
+        <w:rPr>
+          <w:rFonts w:hint="default"/>
+          <w:lang w:val="vi-VN"/>
+        </w:rPr>
+        <w:t>TODO 10.3</w:t>
+      </w:r>
       <w:bookmarkEnd w:id="60"/>
-      <w:r>
-        <w:rPr>
-          <w:rFonts w:hint="default"/>
-          <w:lang w:val="vi-VN"/>
-        </w:rPr>
-        <w:t>TODO 10.3</w:t>
-      </w:r>
     </w:p>
     <w:p>
       <w:pPr>
@@ -9743,11 +9841,14 @@
         </w:rPr>
         <w:t>feat(gateway): add routes for customer, movie and booking services</w:t>
       </w:r>
-    </w:p>
-    <w:p>
-      <w:pPr>
-        <w:pStyle w:val="25"/>
-        <w:numPr>
+      <w:bookmarkStart w:id="66" w:name="_GoBack"/>
+      <w:bookmarkEnd w:id="66"/>
+    </w:p>
+    <w:p>
+      <w:pPr>
+        <w:pStyle w:val="25"/>
+        <w:numPr>
+          <w:ilvl w:val="0"/>
           <w:numId w:val="0"/>
         </w:numPr>
         <w:spacing w:before="60" w:after="60" w:line="312" w:lineRule="auto"/>
@@ -9809,15 +9910,15 @@
           <w:numId w:val="6"/>
         </w:numPr>
       </w:pPr>
-      <w:bookmarkStart w:id="61" w:name="_Toc31494"/>
+      <w:bookmarkStart w:id="61" w:name="_Toc31465"/>
+      <w:r>
+        <w:rPr>
+          <w:rFonts w:hint="default"/>
+          <w:lang w:val="vi-VN"/>
+        </w:rPr>
+        <w:t>TODO 10.4</w:t>
+      </w:r>
       <w:bookmarkEnd w:id="61"/>
-      <w:r>
-        <w:rPr>
-          <w:rFonts w:hint="default"/>
-          <w:lang w:val="vi-VN"/>
-        </w:rPr>
-        <w:t>TODO 10.4</w:t>
-      </w:r>
     </w:p>
     <w:p>
       <w:pPr>
@@ -9866,6 +9967,7 @@
       <w:pPr>
         <w:pStyle w:val="25"/>
         <w:numPr>
+          <w:ilvl w:val="0"/>
           <w:numId w:val="0"/>
         </w:numPr>
         <w:spacing w:before="60" w:after="60" w:line="312" w:lineRule="auto"/>
@@ -9927,7 +10029,7 @@
           <w:numId w:val="6"/>
         </w:numPr>
       </w:pPr>
-      <w:bookmarkStart w:id="62" w:name="_Toc6434"/>
+      <w:bookmarkStart w:id="62" w:name="_Toc15064"/>
       <w:r>
         <w:t>F1</w:t>
       </w:r>
@@ -9964,15 +10066,15 @@
         </w:rPr>
         <w:t xml:space="preserve"> </w:t>
       </w:r>
-      <w:bookmarkStart w:id="63" w:name="_Toc23952"/>
+      <w:bookmarkStart w:id="63" w:name="_Toc30581"/>
+      <w:r>
+        <w:rPr>
+          <w:rFonts w:hint="default"/>
+          <w:lang w:val="vi-VN"/>
+        </w:rPr>
+        <w:t>TODO 11.1</w:t>
+      </w:r>
       <w:bookmarkEnd w:id="63"/>
-      <w:r>
-        <w:rPr>
-          <w:rFonts w:hint="default"/>
-          <w:lang w:val="vi-VN"/>
-        </w:rPr>
-        <w:t>TODO 11.1</w:t>
-      </w:r>
     </w:p>
     <w:p>
       <w:pPr>
@@ -10075,15 +10177,15 @@
           <w:numId w:val="6"/>
         </w:numPr>
       </w:pPr>
-      <w:bookmarkStart w:id="64" w:name="_Toc15348"/>
+      <w:bookmarkStart w:id="64" w:name="_Toc18390"/>
+      <w:r>
+        <w:rPr>
+          <w:rFonts w:hint="default"/>
+          <w:lang w:val="vi-VN"/>
+        </w:rPr>
+        <w:t>TODO 11.2</w:t>
+      </w:r>
       <w:bookmarkEnd w:id="64"/>
-      <w:r>
-        <w:rPr>
-          <w:rFonts w:hint="default"/>
-          <w:lang w:val="vi-VN"/>
-        </w:rPr>
-        <w:t>TODO 11.2</w:t>
-      </w:r>
     </w:p>
     <w:p>
       <w:pPr>
@@ -10132,6 +10234,7 @@
       <w:pPr>
         <w:pStyle w:val="25"/>
         <w:numPr>
+          <w:ilvl w:val="0"/>
           <w:numId w:val="0"/>
         </w:numPr>
         <w:spacing w:before="60" w:after="60" w:line="312" w:lineRule="auto"/>
@@ -10209,15 +10312,15 @@
           <w:numId w:val="6"/>
         </w:numPr>
       </w:pPr>
-      <w:bookmarkStart w:id="65" w:name="_Toc17908"/>
+      <w:bookmarkStart w:id="65" w:name="_Toc4540"/>
+      <w:r>
+        <w:rPr>
+          <w:rFonts w:hint="default"/>
+          <w:lang w:val="vi-VN"/>
+        </w:rPr>
+        <w:t>TODO 11.3</w:t>
+      </w:r>
       <w:bookmarkEnd w:id="65"/>
-      <w:r>
-        <w:rPr>
-          <w:rFonts w:hint="default"/>
-          <w:lang w:val="vi-VN"/>
-        </w:rPr>
-        <w:t>TODO 11.3</w:t>
-      </w:r>
     </w:p>
     <w:p>
       <w:pPr>
@@ -10259,16 +10362,65 @@
           <w:rFonts w:hint="default"/>
           <w:lang w:val="vi-VN"/>
         </w:rPr>
-        <w:t>docs: add run guide a</w:t>
-      </w:r>
-      <w:bookmarkStart w:id="66" w:name="_GoBack"/>
-      <w:bookmarkEnd w:id="66"/>
-      <w:r>
-        <w:rPr>
-          <w:rFonts w:hint="default"/>
-          <w:lang w:val="vi-VN"/>
-        </w:rPr>
-        <w:t>nd test accounts to README</w:t>
+        <w:t>docs: add run guide and test accounts to README</w:t>
+      </w:r>
+    </w:p>
+    <w:p>
+      <w:pPr>
+        <w:pStyle w:val="25"/>
+        <w:numPr>
+          <w:ilvl w:val="0"/>
+          <w:numId w:val="0"/>
+        </w:numPr>
+        <w:spacing w:before="60" w:after="60" w:line="312" w:lineRule="auto"/>
+        <w:contextualSpacing/>
+        <w:jc w:val="both"/>
+        <w:rPr>
+          <w:lang w:val="en-US"/>
+        </w:rPr>
+      </w:pPr>
+      <w:r>
+        <w:drawing>
+          <wp:inline distT="0" distB="0" distL="114300" distR="114300">
+            <wp:extent cx="5937250" cy="6396355"/>
+            <wp:effectExtent l="0" t="0" r="6350" b="4445"/>
+            <wp:docPr id="9" name="Picture 2"/>
+            <wp:cNvGraphicFramePr>
+              <a:graphicFrameLocks xmlns:a="http://schemas.openxmlformats.org/drawingml/2006/main" noChangeAspect="1"/>
+            </wp:cNvGraphicFramePr>
+            <a:graphic xmlns:a="http://schemas.openxmlformats.org/drawingml/2006/main">
+              <a:graphicData uri="http://schemas.openxmlformats.org/drawingml/2006/picture">
+                <pic:pic xmlns:pic="http://schemas.openxmlformats.org/drawingml/2006/picture">
+                  <pic:nvPicPr>
+                    <pic:cNvPr id="9" name="Picture 2"/>
+                    <pic:cNvPicPr>
+                      <a:picLocks noChangeAspect="1"/>
+                    </pic:cNvPicPr>
+                  </pic:nvPicPr>
+                  <pic:blipFill>
+                    <a:blip r:embed="rId61"/>
+                    <a:stretch>
+                      <a:fillRect/>
+                    </a:stretch>
+                  </pic:blipFill>
+                  <pic:spPr>
+                    <a:xfrm>
+                      <a:off x="0" y="0"/>
+                      <a:ext cx="5937250" cy="6396355"/>
+                    </a:xfrm>
+                    <a:prstGeom prst="rect">
+                      <a:avLst/>
+                    </a:prstGeom>
+                    <a:noFill/>
+                    <a:ln>
+                      <a:noFill/>
+                    </a:ln>
+                  </pic:spPr>
+                </pic:pic>
+              </a:graphicData>
+            </a:graphic>
+          </wp:inline>
+        </w:drawing>
       </w:r>
     </w:p>
     <w:sectPr>
@@ -11411,8 +11563,8 @@
     <w:lsdException w:unhideWhenUsed="0" w:uiPriority="69" w:semiHidden="0" w:name="Medium Grid 3"/>
     <w:lsdException w:unhideWhenUsed="0" w:uiPriority="70" w:semiHidden="0" w:name="Dark List"/>
     <w:lsdException w:unhideWhenUsed="0" w:uiPriority="71" w:semiHidden="0" w:name="Colorful Shading"/>
-    <w:lsdException w:unhideWhenUsed="0" w:uiPriority="72" w:semiHidden="0" w:name="Colorful List"/>
-    <w:lsdException w:unhideWhenUsed="0" w:uiPriority="73" w:semiHidden="0" w:name="Colorful Grid"/>
+    <w:lsdException w:qFormat="1" w:unhideWhenUsed="0" w:uiPriority="72" w:semiHidden="0" w:name="Colorful List"/>
+    <w:lsdException w:qFormat="1" w:unhideWhenUsed="0" w:uiPriority="73" w:semiHidden="0" w:name="Colorful Grid"/>
     <w:lsdException w:unhideWhenUsed="0" w:uiPriority="60" w:semiHidden="0" w:name="Light Shading Accent 1"/>
     <w:lsdException w:unhideWhenUsed="0" w:uiPriority="61" w:semiHidden="0" w:name="Light List Accent 1"/>
     <w:lsdException w:unhideWhenUsed="0" w:uiPriority="62" w:semiHidden="0" w:name="Light Grid Accent 1"/>
@@ -11427,9 +11579,9 @@
     <w:lsdException w:unhideWhenUsed="0" w:uiPriority="68" w:semiHidden="0" w:name="Medium Grid 2 Accent 1"/>
     <w:lsdException w:unhideWhenUsed="0" w:uiPriority="69" w:semiHidden="0" w:name="Medium Grid 3 Accent 1"/>
     <w:lsdException w:unhideWhenUsed="0" w:uiPriority="70" w:semiHidden="0" w:name="Dark List Accent 1"/>
-    <w:lsdException w:unhideWhenUsed="0" w:uiPriority="71" w:semiHidden="0" w:name="Colorful Shading Accent 1"/>
-    <w:lsdException w:unhideWhenUsed="0" w:uiPriority="72" w:semiHidden="0" w:name="Colorful List Accent 1"/>
-    <w:lsdException w:unhideWhenUsed="0" w:uiPriority="73" w:semiHidden="0" w:name="Colorful Grid Accent 1"/>
+    <w:lsdException w:qFormat="1" w:unhideWhenUsed="0" w:uiPriority="71" w:semiHidden="0" w:name="Colorful Shading Accent 1"/>
+    <w:lsdException w:qFormat="1" w:unhideWhenUsed="0" w:uiPriority="72" w:semiHidden="0" w:name="Colorful List Accent 1"/>
+    <w:lsdException w:qFormat="1" w:unhideWhenUsed="0" w:uiPriority="73" w:semiHidden="0" w:name="Colorful Grid Accent 1"/>
     <w:lsdException w:unhideWhenUsed="0" w:uiPriority="60" w:semiHidden="0" w:name="Light Shading Accent 2"/>
     <w:lsdException w:unhideWhenUsed="0" w:uiPriority="61" w:semiHidden="0" w:name="Light List Accent 2"/>
     <w:lsdException w:unhideWhenUsed="0" w:uiPriority="62" w:semiHidden="0" w:name="Light Grid Accent 2"/>
@@ -11441,9 +11593,9 @@
     <w:lsdException w:unhideWhenUsed="0" w:uiPriority="68" w:semiHidden="0" w:name="Medium Grid 2 Accent 2"/>
     <w:lsdException w:unhideWhenUsed="0" w:uiPriority="69" w:semiHidden="0" w:name="Medium Grid 3 Accent 2"/>
     <w:lsdException w:unhideWhenUsed="0" w:uiPriority="70" w:semiHidden="0" w:name="Dark List Accent 2"/>
-    <w:lsdException w:unhideWhenUsed="0" w:uiPriority="71" w:semiHidden="0" w:name="Colorful Shading Accent 2"/>
-    <w:lsdException w:unhideWhenUsed="0" w:uiPriority="72" w:semiHidden="0" w:name="Colorful List Accent 2"/>
-    <w:lsdException w:unhideWhenUsed="0" w:uiPriority="73" w:semiHidden="0" w:name="Colorful Grid Accent 2"/>
+    <w:lsdException w:qFormat="1" w:unhideWhenUsed="0" w:uiPriority="71" w:semiHidden="0" w:name="Colorful Shading Accent 2"/>
+    <w:lsdException w:qFormat="1" w:unhideWhenUsed="0" w:uiPriority="72" w:semiHidden="0" w:name="Colorful List Accent 2"/>
+    <w:lsdException w:qFormat="1" w:unhideWhenUsed="0" w:uiPriority="73" w:semiHidden="0" w:name="Colorful Grid Accent 2"/>
     <w:lsdException w:unhideWhenUsed="0" w:uiPriority="60" w:semiHidden="0" w:name="Light Shading Accent 3"/>
     <w:lsdException w:unhideWhenUsed="0" w:uiPriority="61" w:semiHidden="0" w:name="Light List Accent 3"/>
     <w:lsdException w:unhideWhenUsed="0" w:uiPriority="62" w:semiHidden="0" w:name="Light Grid Accent 3"/>
@@ -11455,23 +11607,23 @@
     <w:lsdException w:unhideWhenUsed="0" w:uiPriority="68" w:semiHidden="0" w:name="Medium Grid 2 Accent 3"/>
     <w:lsdException w:unhideWhenUsed="0" w:uiPriority="69" w:semiHidden="0" w:name="Medium Grid 3 Accent 3"/>
     <w:lsdException w:unhideWhenUsed="0" w:uiPriority="70" w:semiHidden="0" w:name="Dark List Accent 3"/>
-    <w:lsdException w:unhideWhenUsed="0" w:uiPriority="71" w:semiHidden="0" w:name="Colorful Shading Accent 3"/>
-    <w:lsdException w:unhideWhenUsed="0" w:uiPriority="72" w:semiHidden="0" w:name="Colorful List Accent 3"/>
-    <w:lsdException w:unhideWhenUsed="0" w:uiPriority="73" w:semiHidden="0" w:name="Colorful Grid Accent 3"/>
+    <w:lsdException w:qFormat="1" w:unhideWhenUsed="0" w:uiPriority="71" w:semiHidden="0" w:name="Colorful Shading Accent 3"/>
+    <w:lsdException w:qFormat="1" w:unhideWhenUsed="0" w:uiPriority="72" w:semiHidden="0" w:name="Colorful List Accent 3"/>
+    <w:lsdException w:qFormat="1" w:unhideWhenUsed="0" w:uiPriority="73" w:semiHidden="0" w:name="Colorful Grid Accent 3"/>
     <w:lsdException w:unhideWhenUsed="0" w:uiPriority="60" w:semiHidden="0" w:name="Light Shading Accent 4"/>
     <w:lsdException w:unhideWhenUsed="0" w:uiPriority="61" w:semiHidden="0" w:name="Light List Accent 4"/>
     <w:lsdException w:unhideWhenUsed="0" w:uiPriority="62" w:semiHidden="0" w:name="Light Grid Accent 4"/>
     <w:lsdException w:unhideWhenUsed="0" w:uiPriority="63" w:semiHidden="0" w:name="Medium Shading 1 Accent 4"/>
     <w:lsdException w:unhideWhenUsed="0" w:uiPriority="64" w:semiHidden="0" w:name="Medium Shading 2 Accent 4"/>
-    <w:lsdException w:unhideWhenUsed="0" w:uiPriority="65" w:semiHidden="0" w:name="Medium List 1 Accent 4"/>
+    <w:lsdException w:qFormat="1" w:unhideWhenUsed="0" w:uiPriority="65" w:semiHidden="0" w:name="Medium List 1 Accent 4"/>
     <w:lsdException w:unhideWhenUsed="0" w:uiPriority="66" w:semiHidden="0" w:name="Medium List 2 Accent 4"/>
     <w:lsdException w:unhideWhenUsed="0" w:uiPriority="67" w:semiHidden="0" w:name="Medium Grid 1 Accent 4"/>
     <w:lsdException w:unhideWhenUsed="0" w:uiPriority="68" w:semiHidden="0" w:name="Medium Grid 2 Accent 4"/>
     <w:lsdException w:unhideWhenUsed="0" w:uiPriority="69" w:semiHidden="0" w:name="Medium Grid 3 Accent 4"/>
     <w:lsdException w:unhideWhenUsed="0" w:uiPriority="70" w:semiHidden="0" w:name="Dark List Accent 4"/>
-    <w:lsdException w:unhideWhenUsed="0" w:uiPriority="71" w:semiHidden="0" w:name="Colorful Shading Accent 4"/>
-    <w:lsdException w:unhideWhenUsed="0" w:uiPriority="72" w:semiHidden="0" w:name="Colorful List Accent 4"/>
-    <w:lsdException w:unhideWhenUsed="0" w:uiPriority="73" w:semiHidden="0" w:name="Colorful Grid Accent 4"/>
+    <w:lsdException w:qFormat="1" w:unhideWhenUsed="0" w:uiPriority="71" w:semiHidden="0" w:name="Colorful Shading Accent 4"/>
+    <w:lsdException w:qFormat="1" w:unhideWhenUsed="0" w:uiPriority="72" w:semiHidden="0" w:name="Colorful List Accent 4"/>
+    <w:lsdException w:qFormat="1" w:unhideWhenUsed="0" w:uiPriority="73" w:semiHidden="0" w:name="Colorful Grid Accent 4"/>
     <w:lsdException w:unhideWhenUsed="0" w:uiPriority="60" w:semiHidden="0" w:name="Light Shading Accent 5"/>
     <w:lsdException w:unhideWhenUsed="0" w:uiPriority="61" w:semiHidden="0" w:name="Light List Accent 5"/>
     <w:lsdException w:unhideWhenUsed="0" w:uiPriority="62" w:semiHidden="0" w:name="Light Grid Accent 5"/>
@@ -11483,9 +11635,9 @@
     <w:lsdException w:unhideWhenUsed="0" w:uiPriority="68" w:semiHidden="0" w:name="Medium Grid 2 Accent 5"/>
     <w:lsdException w:unhideWhenUsed="0" w:uiPriority="69" w:semiHidden="0" w:name="Medium Grid 3 Accent 5"/>
     <w:lsdException w:unhideWhenUsed="0" w:uiPriority="70" w:semiHidden="0" w:name="Dark List Accent 5"/>
-    <w:lsdException w:unhideWhenUsed="0" w:uiPriority="71" w:semiHidden="0" w:name="Colorful Shading Accent 5"/>
-    <w:lsdException w:unhideWhenUsed="0" w:uiPriority="72" w:semiHidden="0" w:name="Colorful List Accent 5"/>
-    <w:lsdException w:unhideWhenUsed="0" w:uiPriority="73" w:semiHidden="0" w:name="Colorful Grid Accent 5"/>
+    <w:lsdException w:qFormat="1" w:unhideWhenUsed="0" w:uiPriority="71" w:semiHidden="0" w:name="Colorful Shading Accent 5"/>
+    <w:lsdException w:qFormat="1" w:unhideWhenUsed="0" w:uiPriority="72" w:semiHidden="0" w:name="Colorful List Accent 5"/>
+    <w:lsdException w:qFormat="1" w:unhideWhenUsed="0" w:uiPriority="73" w:semiHidden="0" w:name="Colorful Grid Accent 5"/>
     <w:lsdException w:unhideWhenUsed="0" w:uiPriority="60" w:semiHidden="0" w:name="Light Shading Accent 6"/>
     <w:lsdException w:unhideWhenUsed="0" w:uiPriority="61" w:semiHidden="0" w:name="Light List Accent 6"/>
     <w:lsdException w:unhideWhenUsed="0" w:uiPriority="62" w:semiHidden="0" w:name="Light Grid Accent 6"/>
@@ -11497,9 +11649,9 @@
     <w:lsdException w:unhideWhenUsed="0" w:uiPriority="68" w:semiHidden="0" w:name="Medium Grid 2 Accent 6"/>
     <w:lsdException w:unhideWhenUsed="0" w:uiPriority="69" w:semiHidden="0" w:name="Medium Grid 3 Accent 6"/>
     <w:lsdException w:unhideWhenUsed="0" w:uiPriority="70" w:semiHidden="0" w:name="Dark List Accent 6"/>
-    <w:lsdException w:unhideWhenUsed="0" w:uiPriority="71" w:semiHidden="0" w:name="Colorful Shading Accent 6"/>
-    <w:lsdException w:unhideWhenUsed="0" w:uiPriority="72" w:semiHidden="0" w:name="Colorful List Accent 6"/>
-    <w:lsdException w:unhideWhenUsed="0" w:uiPriority="73" w:semiHidden="0" w:name="Colorful Grid Accent 6"/>
+    <w:lsdException w:qFormat="1" w:unhideWhenUsed="0" w:uiPriority="71" w:semiHidden="0" w:name="Colorful Shading Accent 6"/>
+    <w:lsdException w:qFormat="1" w:unhideWhenUsed="0" w:uiPriority="72" w:semiHidden="0" w:name="Colorful List Accent 6"/>
+    <w:lsdException w:qFormat="1" w:unhideWhenUsed="0" w:uiPriority="73" w:semiHidden="0" w:name="Colorful Grid Accent 6"/>
   </w:latentStyles>
   <w:style w:type="paragraph" w:default="1" w:styleId="1">
     <w:name w:val="Normal"/>

</xml_diff>